<commit_message>
fix: tạo footer riêng 1 đến 16 để sửa lỗi lặp số trang khi xem trước
</commit_message>
<xml_diff>
--- a/docs/bao-cao-tri-tue-nhan-tao-nhom-6-co-so-trang.docx
+++ b/docs/bao-cao-tri-tue-nhan-tao-nhom-6-co-so-trang.docx
@@ -11,8 +11,6 @@
           <w:szCs w:val="32"/>
         </w:rPr>
       </w:pPr>
-      <w:bookmarkStart w:id="0" w:name="_GoBack"/>
-      <w:bookmarkEnd w:id="0"/>
       <w:r>
         <w:rPr>
           <w:rFonts w:ascii="Times New Roman" w:hAnsi="Times New Roman"/>
@@ -56,12 +54,13 @@
       <w:r>
         <w:rPr>
           <w:rFonts w:ascii="Times New Roman" w:hAnsi="Times New Roman"/>
+          <w:noProof/>
           <w:color w:val="000000"/>
           <w:sz w:val="24"/>
           <w:szCs w:val="24"/>
         </w:rPr>
         <w:drawing>
-          <wp:inline distT="0" distB="0" distL="114300" distR="114300">
+          <wp:inline distT="0" distB="0" distL="114300" distR="114300" wp14:anchorId="20B70BA6" wp14:editId="2946B3F0">
             <wp:extent cx="1195070" cy="1194435"/>
             <wp:effectExtent l="0" t="0" r="0" b="0"/>
             <wp:docPr id="1" name="image1.png"/>
@@ -133,16 +132,7 @@
           <w:sz w:val="72"/>
           <w:szCs w:val="72"/>
         </w:rPr>
-        <w:br w:type="textWrapping"/>
-      </w:r>
-      <w:r>
-        <w:rPr>
-          <w:rFonts w:ascii="Times New Roman" w:hAnsi="Times New Roman"/>
-          <w:b/>
-          <w:color w:val="000000"/>
-          <w:sz w:val="72"/>
-          <w:szCs w:val="72"/>
-        </w:rPr>
+        <w:br/>
         <w:t>ĐỒ ÁN MÔN HỌC</w:t>
       </w:r>
     </w:p>
@@ -213,6 +203,8 @@
           <w:szCs w:val="32"/>
         </w:rPr>
         <w:t>ĐỀ TÀI: Nghiên cứu và trình bày một phương pháp</w:t>
+        <w:br/>
+        <w:t>phân loại văn bản bằng MULTINOMIAL NAIVE BAYES</w:t>
       </w:r>
       <w:r>
         <w:rPr>
@@ -222,17 +214,6 @@
           <w:sz w:val="32"/>
           <w:szCs w:val="32"/>
         </w:rPr>
-        <w:br w:type="textWrapping"/>
-      </w:r>
-      <w:r>
-        <w:rPr>
-          <w:rFonts w:ascii="Times New Roman" w:hAnsi="Times New Roman"/>
-          <w:b/>
-          <w:color w:val="000000"/>
-          <w:sz w:val="32"/>
-          <w:szCs w:val="32"/>
-        </w:rPr>
-        <w:t>phân loại văn bản bằng MULTINOMIAL NAIVE BAYES</w:t>
       </w:r>
     </w:p>
     <w:p>
@@ -348,6 +329,7 @@
           <w:b/>
         </w:rPr>
       </w:pPr>
+      <w:proofErr w:type="spellStart"/>
       <w:r>
         <w:rPr>
           <w:rFonts w:ascii="Times New Roman" w:hAnsi="Times New Roman"/>
@@ -356,6 +338,132 @@
           <w:sz w:val="26"/>
         </w:rPr>
         <w:t>Thực hiện bởi nhóm sinh viên: Nhóm 6</w:t>
+      </w:r>
+      <w:proofErr w:type="spellEnd"/>
+      <w:r>
+        <w:rPr>
+          <w:rFonts w:ascii="Times New Roman" w:hAnsi="Times New Roman"/>
+          <w:b/>
+          <w:color w:val="000000"/>
+          <w:sz w:val="26"/>
+        </w:rPr>
+      </w:r>
+      <w:proofErr w:type="spellStart"/>
+      <w:r>
+        <w:rPr>
+          <w:rFonts w:ascii="Times New Roman" w:hAnsi="Times New Roman"/>
+          <w:b/>
+          <w:color w:val="000000"/>
+          <w:sz w:val="26"/>
+        </w:rPr>
+      </w:r>
+      <w:proofErr w:type="spellEnd"/>
+      <w:r>
+        <w:rPr>
+          <w:rFonts w:ascii="Times New Roman" w:hAnsi="Times New Roman"/>
+          <w:b/>
+          <w:color w:val="000000"/>
+          <w:sz w:val="26"/>
+        </w:rPr>
+      </w:r>
+      <w:proofErr w:type="spellStart"/>
+      <w:r>
+        <w:rPr>
+          <w:rFonts w:ascii="Times New Roman" w:hAnsi="Times New Roman"/>
+          <w:b/>
+          <w:color w:val="000000"/>
+          <w:sz w:val="26"/>
+        </w:rPr>
+      </w:r>
+      <w:proofErr w:type="spellEnd"/>
+      <w:r>
+        <w:rPr>
+          <w:rFonts w:ascii="Times New Roman" w:hAnsi="Times New Roman"/>
+          <w:b/>
+          <w:color w:val="000000"/>
+          <w:sz w:val="26"/>
+        </w:rPr>
+      </w:r>
+      <w:proofErr w:type="spellStart"/>
+      <w:r>
+        <w:rPr>
+          <w:rFonts w:ascii="Times New Roman" w:hAnsi="Times New Roman"/>
+          <w:b/>
+          <w:color w:val="000000"/>
+          <w:sz w:val="26"/>
+        </w:rPr>
+      </w:r>
+      <w:proofErr w:type="spellEnd"/>
+      <w:r>
+        <w:rPr>
+          <w:rFonts w:ascii="Times New Roman" w:hAnsi="Times New Roman"/>
+          <w:b/>
+          <w:color w:val="000000"/>
+          <w:sz w:val="26"/>
+        </w:rPr>
+      </w:r>
+      <w:proofErr w:type="spellStart"/>
+      <w:r>
+        <w:rPr>
+          <w:rFonts w:ascii="Times New Roman" w:hAnsi="Times New Roman"/>
+          <w:b/>
+          <w:color w:val="000000"/>
+          <w:sz w:val="26"/>
+        </w:rPr>
+      </w:r>
+      <w:proofErr w:type="spellEnd"/>
+      <w:r>
+        <w:rPr>
+          <w:rFonts w:ascii="Times New Roman" w:hAnsi="Times New Roman"/>
+          <w:b/>
+          <w:color w:val="000000"/>
+          <w:sz w:val="26"/>
+        </w:rPr>
+      </w:r>
+      <w:proofErr w:type="spellStart"/>
+      <w:r>
+        <w:rPr>
+          <w:rFonts w:ascii="Times New Roman" w:hAnsi="Times New Roman"/>
+          <w:b/>
+          <w:color w:val="000000"/>
+          <w:sz w:val="26"/>
+        </w:rPr>
+      </w:r>
+      <w:proofErr w:type="spellEnd"/>
+      <w:r>
+        <w:rPr>
+          <w:rFonts w:ascii="Times New Roman" w:hAnsi="Times New Roman"/>
+          <w:b/>
+          <w:color w:val="000000"/>
+          <w:sz w:val="26"/>
+          <w:lang w:val="vi-VN"/>
+        </w:rPr>
+      </w:r>
+      <w:r>
+        <w:rPr>
+          <w:rFonts w:ascii="Times New Roman" w:hAnsi="Times New Roman"/>
+          <w:b/>
+          <w:color w:val="000000"/>
+          <w:sz w:val="26"/>
+        </w:rPr>
+      </w:r>
+      <w:proofErr w:type="spellStart"/>
+      <w:r>
+        <w:rPr>
+          <w:rFonts w:ascii="Times New Roman" w:hAnsi="Times New Roman"/>
+          <w:b/>
+          <w:color w:val="000000"/>
+          <w:sz w:val="26"/>
+        </w:rPr>
+      </w:r>
+      <w:proofErr w:type="spellEnd"/>
+      <w:r>
+        <w:rPr>
+          <w:rFonts w:ascii="Times New Roman" w:hAnsi="Times New Roman"/>
+          <w:b/>
+          <w:color w:val="000000"/>
+          <w:sz w:val="26"/>
+        </w:rPr>
       </w:r>
     </w:p>
     <w:p>
@@ -367,6 +475,7 @@
           <w:b/>
         </w:rPr>
       </w:pPr>
+      <w:proofErr w:type="spellStart"/>
       <w:r>
         <w:rPr>
           <w:rFonts w:ascii="Times New Roman" w:hAnsi="Times New Roman"/>
@@ -376,11 +485,137 @@
         </w:rPr>
         <w:t>Lớp: D23VHCNHT01-N</w:t>
       </w:r>
+      <w:proofErr w:type="spellEnd"/>
+      <w:r>
+        <w:rPr>
+          <w:rFonts w:ascii="Times New Roman" w:hAnsi="Times New Roman"/>
+          <w:b/>
+          <w:color w:val="000000"/>
+          <w:sz w:val="26"/>
+        </w:rPr>
+      </w:r>
+      <w:proofErr w:type="spellStart"/>
+      <w:r>
+        <w:rPr>
+          <w:rFonts w:ascii="Times New Roman" w:hAnsi="Times New Roman"/>
+          <w:b/>
+          <w:color w:val="000000"/>
+          <w:sz w:val="26"/>
+        </w:rPr>
+      </w:r>
+      <w:proofErr w:type="spellEnd"/>
+      <w:r>
+        <w:rPr>
+          <w:rFonts w:ascii="Times New Roman" w:hAnsi="Times New Roman"/>
+          <w:b/>
+          <w:color w:val="000000"/>
+          <w:sz w:val="26"/>
+        </w:rPr>
+      </w:r>
+      <w:proofErr w:type="spellStart"/>
+      <w:r>
+        <w:rPr>
+          <w:rFonts w:ascii="Times New Roman" w:hAnsi="Times New Roman"/>
+          <w:b/>
+          <w:color w:val="000000"/>
+          <w:sz w:val="26"/>
+        </w:rPr>
+      </w:r>
+      <w:proofErr w:type="spellEnd"/>
+      <w:r>
+        <w:rPr>
+          <w:rFonts w:ascii="Times New Roman" w:hAnsi="Times New Roman"/>
+          <w:b/>
+          <w:color w:val="000000"/>
+          <w:sz w:val="26"/>
+        </w:rPr>
+      </w:r>
+      <w:proofErr w:type="spellStart"/>
+      <w:r>
+        <w:rPr>
+          <w:rFonts w:ascii="Times New Roman" w:hAnsi="Times New Roman"/>
+          <w:b/>
+          <w:color w:val="000000"/>
+          <w:sz w:val="26"/>
+        </w:rPr>
+      </w:r>
+      <w:proofErr w:type="spellEnd"/>
+      <w:r>
+        <w:rPr>
+          <w:rFonts w:ascii="Times New Roman" w:hAnsi="Times New Roman"/>
+          <w:b/>
+          <w:color w:val="000000"/>
+          <w:sz w:val="26"/>
+        </w:rPr>
+      </w:r>
+      <w:proofErr w:type="spellStart"/>
+      <w:r>
+        <w:rPr>
+          <w:rFonts w:ascii="Times New Roman" w:hAnsi="Times New Roman"/>
+          <w:b/>
+          <w:color w:val="000000"/>
+          <w:sz w:val="26"/>
+        </w:rPr>
+      </w:r>
+      <w:proofErr w:type="spellEnd"/>
+      <w:r>
+        <w:rPr>
+          <w:rFonts w:ascii="Times New Roman" w:hAnsi="Times New Roman"/>
+          <w:b/>
+          <w:color w:val="000000"/>
+          <w:sz w:val="26"/>
+        </w:rPr>
+      </w:r>
+      <w:proofErr w:type="spellStart"/>
+      <w:r>
+        <w:rPr>
+          <w:rFonts w:ascii="Times New Roman" w:hAnsi="Times New Roman"/>
+          <w:b/>
+          <w:color w:val="000000"/>
+          <w:sz w:val="26"/>
+        </w:rPr>
+      </w:r>
+      <w:proofErr w:type="spellEnd"/>
+      <w:r>
+        <w:rPr>
+          <w:rFonts w:ascii="Times New Roman" w:hAnsi="Times New Roman"/>
+          <w:b/>
+          <w:color w:val="000000"/>
+          <w:sz w:val="26"/>
+          <w:lang w:val="vi-VN"/>
+        </w:rPr>
+      </w:r>
+      <w:r>
+        <w:rPr>
+          <w:rFonts w:ascii="Times New Roman" w:hAnsi="Times New Roman"/>
+          <w:b/>
+          <w:color w:val="000000"/>
+          <w:sz w:val="26"/>
+        </w:rPr>
+      </w:r>
+      <w:proofErr w:type="spellStart"/>
+      <w:r>
+        <w:rPr>
+          <w:rFonts w:ascii="Times New Roman" w:hAnsi="Times New Roman"/>
+          <w:b/>
+          <w:color w:val="000000"/>
+          <w:sz w:val="26"/>
+        </w:rPr>
+      </w:r>
+      <w:proofErr w:type="spellEnd"/>
+      <w:r>
+        <w:rPr>
+          <w:rFonts w:ascii="Times New Roman" w:hAnsi="Times New Roman"/>
+          <w:b/>
+          <w:color w:val="000000"/>
+          <w:sz w:val="26"/>
+        </w:rPr>
+      </w:r>
     </w:p>
     <w:p>
       <w:pPr>
         <w:tabs>
-          <w:tab w:val="left" w:pos="6123"/>
+          <w:tab w:pos="6123" w:val="left"/>
         </w:tabs>
         <w:spacing w:after="120" w:line="240" w:lineRule="auto"/>
         <w:ind w:left="850"/>
@@ -395,28 +630,117 @@
           <w:sz w:val="26"/>
         </w:rPr>
         <w:t>1. Lại Huy Thịnh</w:t>
-      </w:r>
+        <w:tab/>
+        <w:t>N23DVCN057</w:t>
+      </w:r>
+      <w:proofErr w:type="spellStart"/>
       <w:r>
         <w:rPr>
           <w:rFonts w:ascii="Times New Roman" w:hAnsi="Times New Roman"/>
           <w:color w:val="000000"/>
           <w:sz w:val="26"/>
         </w:rPr>
-        <w:tab/>
-      </w:r>
+      </w:r>
+      <w:proofErr w:type="spellEnd"/>
       <w:r>
         <w:rPr>
           <w:rFonts w:ascii="Times New Roman" w:hAnsi="Times New Roman"/>
           <w:color w:val="000000"/>
           <w:sz w:val="26"/>
         </w:rPr>
-        <w:t>N23DVCN057</w:t>
-      </w:r>
+      </w:r>
+      <w:proofErr w:type="spellStart"/>
+      <w:r>
+        <w:rPr>
+          <w:rFonts w:ascii="Times New Roman" w:hAnsi="Times New Roman"/>
+          <w:color w:val="000000"/>
+          <w:sz w:val="26"/>
+        </w:rPr>
+      </w:r>
+      <w:proofErr w:type="spellEnd"/>
+      <w:r>
+        <w:rPr>
+          <w:rFonts w:ascii="Times New Roman" w:hAnsi="Times New Roman"/>
+          <w:color w:val="000000"/>
+          <w:sz w:val="26"/>
+        </w:rPr>
+      </w:r>
+      <w:r>
+        <w:rPr>
+          <w:rFonts w:ascii="Times New Roman" w:hAnsi="Times New Roman"/>
+          <w:color w:val="000000"/>
+          <w:sz w:val="26"/>
+          <w:lang w:val="vi-VN"/>
+        </w:rPr>
+      </w:r>
+      <w:r>
+        <w:rPr>
+          <w:rFonts w:ascii="Times New Roman" w:hAnsi="Times New Roman"/>
+          <w:color w:val="000000"/>
+          <w:sz w:val="26"/>
+        </w:rPr>
+      </w:r>
+      <w:r>
+        <w:rPr>
+          <w:rFonts w:ascii="Times New Roman" w:hAnsi="Times New Roman"/>
+          <w:color w:val="000000"/>
+          <w:sz w:val="26"/>
+          <w:lang w:val="vi-VN"/>
+        </w:rPr>
+      </w:r>
+      <w:r>
+        <w:rPr>
+          <w:rFonts w:ascii="Times New Roman" w:hAnsi="Times New Roman"/>
+          <w:color w:val="000000"/>
+          <w:sz w:val="26"/>
+          <w:lang w:val="vi-VN"/>
+        </w:rPr>
+      </w:r>
+      <w:r>
+        <w:rPr>
+          <w:rFonts w:ascii="Times New Roman" w:hAnsi="Times New Roman"/>
+          <w:color w:val="000000"/>
+          <w:sz w:val="26"/>
+        </w:rPr>
+      </w:r>
+      <w:r>
+        <w:rPr>
+          <w:rFonts w:ascii="Times New Roman" w:hAnsi="Times New Roman"/>
+          <w:color w:val="000000"/>
+          <w:sz w:val="26"/>
+          <w:lang w:val="vi-VN"/>
+        </w:rPr>
+      </w:r>
+      <w:proofErr w:type="spellStart"/>
+      <w:r>
+        <w:rPr>
+          <w:rFonts w:ascii="Times New Roman" w:hAnsi="Times New Roman"/>
+          <w:color w:val="000000"/>
+          <w:sz w:val="26"/>
+        </w:rPr>
+      </w:r>
+      <w:proofErr w:type="spellEnd"/>
+      <w:r>
+        <w:rPr>
+          <w:rFonts w:ascii="Times New Roman" w:hAnsi="Times New Roman"/>
+          <w:color w:val="000000"/>
+          <w:sz w:val="26"/>
+        </w:rPr>
+      </w:r>
+      <w:proofErr w:type="spellStart"/>
+      <w:r>
+        <w:rPr>
+          <w:rFonts w:ascii="Times New Roman" w:hAnsi="Times New Roman"/>
+          <w:color w:val="000000"/>
+          <w:sz w:val="26"/>
+        </w:rPr>
+      </w:r>
+      <w:proofErr w:type="spellEnd"/>
     </w:p>
     <w:p>
       <w:pPr>
         <w:tabs>
-          <w:tab w:val="left" w:pos="6123"/>
+          <w:tab w:pos="6123" w:val="left"/>
         </w:tabs>
         <w:spacing w:after="120" w:line="240" w:lineRule="auto"/>
         <w:ind w:left="850"/>
@@ -424,6 +748,7 @@
           <w:b/>
         </w:rPr>
       </w:pPr>
+      <w:proofErr w:type="spellStart"/>
       <w:r>
         <w:rPr>
           <w:rFonts w:ascii="Times New Roman" w:hAnsi="Times New Roman"/>
@@ -431,28 +756,115 @@
           <w:sz w:val="26"/>
         </w:rPr>
         <w:t>2. Nguyễn Hữu Đức</w:t>
-      </w:r>
+        <w:tab/>
+        <w:t>N23DVCN012</w:t>
+      </w:r>
+      <w:proofErr w:type="spellEnd"/>
       <w:r>
         <w:rPr>
           <w:rFonts w:ascii="Times New Roman" w:hAnsi="Times New Roman"/>
           <w:color w:val="000000"/>
           <w:sz w:val="26"/>
         </w:rPr>
-        <w:tab/>
-      </w:r>
+      </w:r>
+      <w:proofErr w:type="spellStart"/>
       <w:r>
         <w:rPr>
           <w:rFonts w:ascii="Times New Roman" w:hAnsi="Times New Roman"/>
           <w:color w:val="000000"/>
           <w:sz w:val="26"/>
         </w:rPr>
-        <w:t>N23DVCN012</w:t>
-      </w:r>
+      </w:r>
+      <w:proofErr w:type="spellEnd"/>
+      <w:r>
+        <w:rPr>
+          <w:rFonts w:ascii="Times New Roman" w:hAnsi="Times New Roman"/>
+          <w:color w:val="000000"/>
+          <w:sz w:val="26"/>
+        </w:rPr>
+      </w:r>
+      <w:r>
+        <w:rPr>
+          <w:rFonts w:ascii="Times New Roman" w:hAnsi="Times New Roman"/>
+          <w:color w:val="000000"/>
+          <w:sz w:val="26"/>
+          <w:lang w:val="vi-VN"/>
+        </w:rPr>
+      </w:r>
+      <w:r>
+        <w:rPr>
+          <w:rFonts w:ascii="Times New Roman" w:hAnsi="Times New Roman"/>
+          <w:color w:val="000000"/>
+          <w:sz w:val="26"/>
+        </w:rPr>
+      </w:r>
+      <w:r>
+        <w:rPr>
+          <w:rFonts w:ascii="Times New Roman" w:hAnsi="Times New Roman"/>
+          <w:color w:val="000000"/>
+          <w:sz w:val="26"/>
+          <w:lang w:val="vi-VN"/>
+        </w:rPr>
+      </w:r>
+      <w:r>
+        <w:rPr>
+          <w:rFonts w:ascii="Times New Roman" w:hAnsi="Times New Roman"/>
+          <w:color w:val="000000"/>
+          <w:sz w:val="26"/>
+        </w:rPr>
+      </w:r>
+      <w:r>
+        <w:rPr>
+          <w:rFonts w:ascii="Times New Roman" w:hAnsi="Times New Roman"/>
+          <w:color w:val="000000"/>
+          <w:sz w:val="26"/>
+          <w:lang w:val="vi-VN"/>
+        </w:rPr>
+      </w:r>
+      <w:r>
+        <w:rPr>
+          <w:rFonts w:ascii="Times New Roman" w:hAnsi="Times New Roman"/>
+          <w:color w:val="000000"/>
+          <w:sz w:val="26"/>
+          <w:lang w:val="vi-VN"/>
+        </w:rPr>
+      </w:r>
+      <w:r>
+        <w:rPr>
+          <w:rFonts w:ascii="Times New Roman" w:hAnsi="Times New Roman"/>
+          <w:color w:val="000000"/>
+          <w:sz w:val="26"/>
+        </w:rPr>
+      </w:r>
+      <w:r>
+        <w:rPr>
+          <w:rFonts w:ascii="Times New Roman" w:hAnsi="Times New Roman"/>
+          <w:color w:val="000000"/>
+          <w:sz w:val="26"/>
+          <w:lang w:val="vi-VN"/>
+        </w:rPr>
+      </w:r>
+      <w:r>
+        <w:rPr>
+          <w:rFonts w:ascii="Times New Roman" w:hAnsi="Times New Roman"/>
+          <w:color w:val="000000"/>
+          <w:sz w:val="26"/>
+        </w:rPr>
+      </w:r>
+      <w:proofErr w:type="spellStart"/>
+      <w:r>
+        <w:rPr>
+          <w:rFonts w:ascii="Times New Roman" w:hAnsi="Times New Roman"/>
+          <w:color w:val="000000"/>
+          <w:sz w:val="26"/>
+        </w:rPr>
+      </w:r>
+      <w:proofErr w:type="spellEnd"/>
     </w:p>
     <w:p>
       <w:pPr>
         <w:tabs>
-          <w:tab w:val="left" w:pos="6123"/>
+          <w:tab w:pos="6123" w:val="left"/>
         </w:tabs>
         <w:spacing w:after="120" w:line="240" w:lineRule="auto"/>
         <w:ind w:left="850"/>
@@ -460,6 +872,7 @@
           <w:lang w:val="vi-VN"/>
         </w:rPr>
       </w:pPr>
+      <w:proofErr w:type="spellStart"/>
       <w:r>
         <w:rPr>
           <w:rFonts w:ascii="Times New Roman" w:hAnsi="Times New Roman"/>
@@ -467,23 +880,126 @@
           <w:sz w:val="26"/>
         </w:rPr>
         <w:t>3. Nguyễn Trần Mạnh Dũng</w:t>
-      </w:r>
+        <w:tab/>
+        <w:t>N23DVCN015</w:t>
+      </w:r>
+      <w:proofErr w:type="spellEnd"/>
       <w:r>
         <w:rPr>
           <w:rFonts w:ascii="Times New Roman" w:hAnsi="Times New Roman"/>
           <w:color w:val="000000"/>
           <w:sz w:val="26"/>
         </w:rPr>
-        <w:tab/>
-      </w:r>
+      </w:r>
+      <w:proofErr w:type="spellStart"/>
       <w:r>
         <w:rPr>
           <w:rFonts w:ascii="Times New Roman" w:hAnsi="Times New Roman"/>
           <w:color w:val="000000"/>
           <w:sz w:val="26"/>
         </w:rPr>
-        <w:t>N23DVCN015</w:t>
-      </w:r>
+      </w:r>
+      <w:proofErr w:type="spellEnd"/>
+      <w:r>
+        <w:rPr>
+          <w:rFonts w:ascii="Times New Roman" w:hAnsi="Times New Roman"/>
+          <w:color w:val="000000"/>
+          <w:sz w:val="26"/>
+        </w:rPr>
+      </w:r>
+      <w:proofErr w:type="spellStart"/>
+      <w:r>
+        <w:rPr>
+          <w:rFonts w:ascii="Times New Roman" w:hAnsi="Times New Roman"/>
+          <w:color w:val="000000"/>
+          <w:sz w:val="26"/>
+        </w:rPr>
+      </w:r>
+      <w:proofErr w:type="spellEnd"/>
+      <w:r>
+        <w:rPr>
+          <w:rFonts w:ascii="Times New Roman" w:hAnsi="Times New Roman"/>
+          <w:color w:val="000000"/>
+          <w:sz w:val="26"/>
+        </w:rPr>
+      </w:r>
+      <w:r>
+        <w:rPr>
+          <w:rFonts w:ascii="Times New Roman" w:hAnsi="Times New Roman"/>
+          <w:color w:val="000000"/>
+          <w:sz w:val="26"/>
+          <w:lang w:val="vi-VN"/>
+        </w:rPr>
+      </w:r>
+      <w:r>
+        <w:rPr>
+          <w:rFonts w:ascii="Times New Roman" w:hAnsi="Times New Roman"/>
+          <w:color w:val="000000"/>
+          <w:sz w:val="26"/>
+        </w:rPr>
+      </w:r>
+      <w:r>
+        <w:rPr>
+          <w:rFonts w:ascii="Times New Roman" w:hAnsi="Times New Roman"/>
+          <w:color w:val="000000"/>
+          <w:sz w:val="26"/>
+          <w:lang w:val="vi-VN"/>
+        </w:rPr>
+      </w:r>
+      <w:r>
+        <w:rPr>
+          <w:rFonts w:ascii="Times New Roman" w:hAnsi="Times New Roman"/>
+          <w:color w:val="000000"/>
+          <w:sz w:val="26"/>
+        </w:rPr>
+      </w:r>
+      <w:r>
+        <w:rPr>
+          <w:rFonts w:ascii="Times New Roman" w:hAnsi="Times New Roman"/>
+          <w:color w:val="000000"/>
+          <w:sz w:val="26"/>
+          <w:lang w:val="vi-VN"/>
+        </w:rPr>
+      </w:r>
+      <w:r>
+        <w:rPr>
+          <w:rFonts w:ascii="Times New Roman" w:hAnsi="Times New Roman"/>
+          <w:color w:val="000000"/>
+          <w:sz w:val="26"/>
+          <w:lang w:val="vi-VN"/>
+        </w:rPr>
+      </w:r>
+      <w:r>
+        <w:rPr>
+          <w:rFonts w:ascii="Times New Roman" w:hAnsi="Times New Roman"/>
+          <w:color w:val="000000"/>
+          <w:sz w:val="26"/>
+        </w:rPr>
+      </w:r>
+      <w:r>
+        <w:rPr>
+          <w:rFonts w:ascii="Times New Roman" w:hAnsi="Times New Roman"/>
+          <w:color w:val="000000"/>
+          <w:sz w:val="26"/>
+          <w:lang w:val="vi-VN"/>
+        </w:rPr>
+      </w:r>
+      <w:r>
+        <w:rPr>
+          <w:rFonts w:ascii="Times New Roman" w:hAnsi="Times New Roman"/>
+          <w:color w:val="000000"/>
+          <w:sz w:val="26"/>
+        </w:rPr>
+      </w:r>
+      <w:proofErr w:type="spellStart"/>
+      <w:r>
+        <w:rPr>
+          <w:rFonts w:ascii="Times New Roman" w:hAnsi="Times New Roman"/>
+          <w:color w:val="000000"/>
+          <w:sz w:val="26"/>
+        </w:rPr>
+      </w:r>
+      <w:proofErr w:type="spellEnd"/>
     </w:p>
     <w:p>
       <w:pPr>
@@ -491,6 +1007,7 @@
         <w:ind w:left="0" w:right="0"/>
         <w:jc w:val="center"/>
       </w:pPr>
+      <w:proofErr w:type="spellStart"/>
       <w:r>
         <w:rPr>
           <w:rFonts w:ascii="Times New Roman" w:hAnsi="Times New Roman"/>
@@ -500,6 +1017,133 @@
         </w:rPr>
         <w:t>Giảng viên hướng dẫn: ................................................</w:t>
       </w:r>
+      <w:proofErr w:type="spellEnd"/>
+      <w:r>
+        <w:rPr>
+          <w:rFonts w:ascii="Times New Roman" w:hAnsi="Times New Roman"/>
+          <w:b/>
+          <w:color w:val="000000"/>
+          <w:sz w:val="26"/>
+        </w:rPr>
+      </w:r>
+      <w:proofErr w:type="spellStart"/>
+      <w:r>
+        <w:rPr>
+          <w:rFonts w:ascii="Times New Roman" w:hAnsi="Times New Roman"/>
+          <w:b/>
+          <w:color w:val="000000"/>
+          <w:sz w:val="26"/>
+        </w:rPr>
+      </w:r>
+      <w:proofErr w:type="spellEnd"/>
+      <w:r>
+        <w:rPr>
+          <w:rFonts w:ascii="Times New Roman" w:hAnsi="Times New Roman"/>
+          <w:b/>
+          <w:color w:val="000000"/>
+          <w:sz w:val="26"/>
+        </w:rPr>
+      </w:r>
+      <w:proofErr w:type="spellStart"/>
+      <w:r>
+        <w:rPr>
+          <w:rFonts w:ascii="Times New Roman" w:hAnsi="Times New Roman"/>
+          <w:b/>
+          <w:color w:val="000000"/>
+          <w:sz w:val="26"/>
+        </w:rPr>
+      </w:r>
+      <w:proofErr w:type="spellEnd"/>
+      <w:r>
+        <w:rPr>
+          <w:rFonts w:ascii="Times New Roman" w:hAnsi="Times New Roman"/>
+          <w:b/>
+          <w:color w:val="000000"/>
+          <w:sz w:val="26"/>
+        </w:rPr>
+      </w:r>
+      <w:proofErr w:type="spellStart"/>
+      <w:r>
+        <w:rPr>
+          <w:rFonts w:ascii="Times New Roman" w:hAnsi="Times New Roman"/>
+          <w:b/>
+          <w:color w:val="000000"/>
+          <w:sz w:val="26"/>
+        </w:rPr>
+      </w:r>
+      <w:proofErr w:type="spellEnd"/>
+      <w:r>
+        <w:rPr>
+          <w:rFonts w:ascii="Times New Roman" w:hAnsi="Times New Roman"/>
+          <w:b/>
+          <w:color w:val="000000"/>
+          <w:sz w:val="26"/>
+        </w:rPr>
+      </w:r>
+      <w:proofErr w:type="spellStart"/>
+      <w:r>
+        <w:rPr>
+          <w:rFonts w:ascii="Times New Roman" w:hAnsi="Times New Roman"/>
+          <w:b/>
+          <w:color w:val="000000"/>
+          <w:sz w:val="26"/>
+        </w:rPr>
+      </w:r>
+      <w:proofErr w:type="spellEnd"/>
+      <w:r>
+        <w:rPr>
+          <w:rFonts w:ascii="Times New Roman" w:hAnsi="Times New Roman"/>
+          <w:b/>
+          <w:color w:val="000000"/>
+          <w:sz w:val="26"/>
+        </w:rPr>
+      </w:r>
+      <w:proofErr w:type="spellStart"/>
+      <w:r>
+        <w:rPr>
+          <w:rFonts w:ascii="Times New Roman" w:hAnsi="Times New Roman"/>
+          <w:b/>
+          <w:color w:val="000000"/>
+          <w:sz w:val="26"/>
+        </w:rPr>
+      </w:r>
+      <w:proofErr w:type="spellEnd"/>
+      <w:r>
+        <w:rPr>
+          <w:rFonts w:ascii="Times New Roman" w:hAnsi="Times New Roman"/>
+          <w:b/>
+          <w:color w:val="000000"/>
+          <w:sz w:val="26"/>
+        </w:rPr>
+      </w:r>
+      <w:proofErr w:type="spellStart"/>
+      <w:r>
+        <w:rPr>
+          <w:rFonts w:ascii="Times New Roman" w:hAnsi="Times New Roman"/>
+          <w:b/>
+          <w:color w:val="000000"/>
+          <w:sz w:val="26"/>
+        </w:rPr>
+      </w:r>
+      <w:proofErr w:type="spellEnd"/>
+      <w:r>
+        <w:rPr>
+          <w:rFonts w:ascii="Times New Roman" w:hAnsi="Times New Roman"/>
+          <w:b/>
+          <w:color w:val="000000"/>
+          <w:sz w:val="26"/>
+        </w:rPr>
+      </w:r>
+      <w:proofErr w:type="spellStart"/>
+      <w:r>
+        <w:rPr>
+          <w:rFonts w:ascii="Times New Roman" w:hAnsi="Times New Roman"/>
+          <w:b/>
+          <w:color w:val="000000"/>
+          <w:sz w:val="26"/>
+        </w:rPr>
+      </w:r>
+      <w:proofErr w:type="spellEnd"/>
     </w:p>
     <w:p>
       <w:pPr>
@@ -564,14 +1208,37 @@
         </w:rPr>
         <w:t>TP.HCM, tháng 10/2026</w:t>
       </w:r>
+      <w:proofErr w:type="spellStart"/>
+      <w:r>
+        <w:rPr>
+          <w:rFonts w:ascii="Times New Roman" w:hAnsi="Times New Roman"/>
+          <w:b/>
+          <w:color w:val="000000"/>
+          <w:sz w:val="26"/>
+        </w:rPr>
+      </w:r>
+      <w:proofErr w:type="spellEnd"/>
+      <w:r>
+        <w:rPr>
+          <w:rFonts w:ascii="Times New Roman" w:hAnsi="Times New Roman"/>
+          <w:b/>
+          <w:color w:val="000000"/>
+          <w:sz w:val="26"/>
+        </w:rPr>
+      </w:r>
     </w:p>
     <w:p>
-      <w:r>
-        <w:rPr>
-          <w:color w:val="000000"/>
-        </w:rPr>
-        <w:br w:type="page"/>
-      </w:r>
+      <w:pPr>
+        <w:sectPr>
+          <w:footerReference w:type="default" r:id="rId29"/>
+          <w:type w:val="nextPage"/>
+          <w:pgSz w:w="11906" w:h="16838"/>
+          <w:pgMar w:top="1247" w:right="1134" w:bottom="1134" w:left="1701" w:header="720" w:footer="567" w:gutter="0"/>
+          <w:cols w:space="720" w:num="1"/>
+          <w:docGrid w:linePitch="360" w:charSpace="0"/>
+          <w:pgNumType w:start="1"/>
+        </w:sectPr>
+      </w:pPr>
     </w:p>
     <w:p>
       <w:pPr>
@@ -589,52 +1256,29 @@
     </w:p>
     <w:tbl>
       <w:tblPr>
-        <w:tblStyle w:val="12"/>
-        <w:tblW w:w="0" w:type="auto"/>
-        <w:tblInd w:w="0" w:type="dxa"/>
+        <w:tblW w:type="auto" w:w="0"/>
+        <w:tblLayout w:type="fixed"/>
+        <w:tblLook w:firstColumn="1" w:firstRow="1" w:lastColumn="0" w:lastRow="0" w:noHBand="0" w:noVBand="1" w:val="04A0"/>
         <w:tblBorders>
-          <w:top w:val="none" w:color="auto" w:sz="0" w:space="0"/>
-          <w:left w:val="none" w:color="auto" w:sz="0" w:space="0"/>
-          <w:bottom w:val="none" w:color="auto" w:sz="0" w:space="0"/>
-          <w:right w:val="none" w:color="auto" w:sz="0" w:space="0"/>
-          <w:insideH w:val="none" w:color="auto" w:sz="0" w:space="0"/>
-          <w:insideV w:val="none" w:color="auto" w:sz="0" w:space="0"/>
+          <w:top w:val="nil"/>
+          <w:left w:val="nil"/>
+          <w:bottom w:val="nil"/>
+          <w:right w:val="nil"/>
+          <w:insideH w:val="nil"/>
+          <w:insideV w:val="nil"/>
         </w:tblBorders>
-        <w:tblLayout w:type="fixed"/>
-        <w:tblCellMar>
-          <w:top w:w="0" w:type="dxa"/>
-          <w:left w:w="108" w:type="dxa"/>
-          <w:bottom w:w="0" w:type="dxa"/>
-          <w:right w:w="108" w:type="dxa"/>
-        </w:tblCellMar>
       </w:tblPr>
       <w:tblGrid>
         <w:gridCol w:w="8674"/>
         <w:gridCol w:w="397"/>
       </w:tblGrid>
       <w:tr>
-        <w:tblPrEx>
-          <w:tblBorders>
-            <w:top w:val="none" w:color="auto" w:sz="0" w:space="0"/>
-            <w:left w:val="none" w:color="auto" w:sz="0" w:space="0"/>
-            <w:bottom w:val="none" w:color="auto" w:sz="0" w:space="0"/>
-            <w:right w:val="none" w:color="auto" w:sz="0" w:space="0"/>
-            <w:insideH w:val="none" w:color="auto" w:sz="0" w:space="0"/>
-            <w:insideV w:val="none" w:color="auto" w:sz="0" w:space="0"/>
-          </w:tblBorders>
-          <w:tblCellMar>
-            <w:top w:w="0" w:type="dxa"/>
-            <w:left w:w="108" w:type="dxa"/>
-            <w:bottom w:w="0" w:type="dxa"/>
-            <w:right w:w="108" w:type="dxa"/>
-          </w:tblCellMar>
-        </w:tblPrEx>
         <w:trPr>
           <w:cantSplit/>
         </w:trPr>
         <w:tc>
           <w:tcPr>
-            <w:tcW w:w="8674" w:type="dxa"/>
+            <w:tcW w:type="dxa" w:w="8674"/>
             <w:tcMar>
               <w:top w:w="0" w:type="dxa"/>
               <w:left w:w="0" w:type="dxa"/>
@@ -645,7 +1289,7 @@
           <w:p>
             <w:pPr>
               <w:keepNext w:val="0"/>
-              <w:spacing w:before="0" w:after="140" w:line="340" w:lineRule="exact"/>
+              <w:spacing w:line="340" w:lineRule="exact" w:before="0" w:after="140"/>
               <w:ind w:left="0" w:right="0" w:firstLine="0"/>
               <w:jc w:val="left"/>
             </w:pPr>
@@ -662,7 +1306,7 @@
         </w:tc>
         <w:tc>
           <w:tcPr>
-            <w:tcW w:w="397" w:type="dxa"/>
+            <w:tcW w:type="dxa" w:w="397"/>
             <w:tcMar>
               <w:top w:w="0" w:type="dxa"/>
               <w:left w:w="0" w:type="dxa"/>
@@ -673,7 +1317,7 @@
           <w:p>
             <w:pPr>
               <w:keepNext w:val="0"/>
-              <w:spacing w:before="0" w:after="140" w:line="340" w:lineRule="exact"/>
+              <w:spacing w:line="340" w:lineRule="exact" w:before="0" w:after="140"/>
               <w:ind w:left="0" w:right="0" w:firstLine="0"/>
               <w:jc w:val="right"/>
             </w:pPr>
@@ -690,28 +1334,12 @@
         </w:tc>
       </w:tr>
       <w:tr>
-        <w:tblPrEx>
-          <w:tblBorders>
-            <w:top w:val="none" w:color="auto" w:sz="0" w:space="0"/>
-            <w:left w:val="none" w:color="auto" w:sz="0" w:space="0"/>
-            <w:bottom w:val="none" w:color="auto" w:sz="0" w:space="0"/>
-            <w:right w:val="none" w:color="auto" w:sz="0" w:space="0"/>
-            <w:insideH w:val="none" w:color="auto" w:sz="0" w:space="0"/>
-            <w:insideV w:val="none" w:color="auto" w:sz="0" w:space="0"/>
-          </w:tblBorders>
-          <w:tblCellMar>
-            <w:top w:w="0" w:type="dxa"/>
-            <w:left w:w="108" w:type="dxa"/>
-            <w:bottom w:w="0" w:type="dxa"/>
-            <w:right w:w="108" w:type="dxa"/>
-          </w:tblCellMar>
-        </w:tblPrEx>
         <w:trPr>
           <w:cantSplit/>
         </w:trPr>
         <w:tc>
           <w:tcPr>
-            <w:tcW w:w="8674" w:type="dxa"/>
+            <w:tcW w:type="dxa" w:w="8674"/>
             <w:tcMar>
               <w:top w:w="0" w:type="dxa"/>
               <w:left w:w="0" w:type="dxa"/>
@@ -722,7 +1350,7 @@
           <w:p>
             <w:pPr>
               <w:keepNext w:val="0"/>
-              <w:spacing w:before="0" w:after="140" w:line="340" w:lineRule="exact"/>
+              <w:spacing w:line="340" w:lineRule="exact" w:before="0" w:after="140"/>
               <w:ind w:left="0" w:right="0" w:firstLine="0"/>
               <w:jc w:val="left"/>
             </w:pPr>
@@ -739,7 +1367,7 @@
         </w:tc>
         <w:tc>
           <w:tcPr>
-            <w:tcW w:w="397" w:type="dxa"/>
+            <w:tcW w:type="dxa" w:w="397"/>
             <w:tcMar>
               <w:top w:w="0" w:type="dxa"/>
               <w:left w:w="0" w:type="dxa"/>
@@ -750,7 +1378,7 @@
           <w:p>
             <w:pPr>
               <w:keepNext w:val="0"/>
-              <w:spacing w:before="0" w:after="140" w:line="340" w:lineRule="exact"/>
+              <w:spacing w:line="340" w:lineRule="exact" w:before="0" w:after="140"/>
               <w:ind w:left="0" w:right="0" w:firstLine="0"/>
               <w:jc w:val="right"/>
             </w:pPr>
@@ -767,28 +1395,12 @@
         </w:tc>
       </w:tr>
       <w:tr>
-        <w:tblPrEx>
-          <w:tblBorders>
-            <w:top w:val="none" w:color="auto" w:sz="0" w:space="0"/>
-            <w:left w:val="none" w:color="auto" w:sz="0" w:space="0"/>
-            <w:bottom w:val="none" w:color="auto" w:sz="0" w:space="0"/>
-            <w:right w:val="none" w:color="auto" w:sz="0" w:space="0"/>
-            <w:insideH w:val="none" w:color="auto" w:sz="0" w:space="0"/>
-            <w:insideV w:val="none" w:color="auto" w:sz="0" w:space="0"/>
-          </w:tblBorders>
-          <w:tblCellMar>
-            <w:top w:w="0" w:type="dxa"/>
-            <w:left w:w="108" w:type="dxa"/>
-            <w:bottom w:w="0" w:type="dxa"/>
-            <w:right w:w="108" w:type="dxa"/>
-          </w:tblCellMar>
-        </w:tblPrEx>
         <w:trPr>
           <w:cantSplit/>
         </w:trPr>
         <w:tc>
           <w:tcPr>
-            <w:tcW w:w="8674" w:type="dxa"/>
+            <w:tcW w:type="dxa" w:w="8674"/>
             <w:tcMar>
               <w:top w:w="0" w:type="dxa"/>
               <w:left w:w="0" w:type="dxa"/>
@@ -799,7 +1411,7 @@
           <w:p>
             <w:pPr>
               <w:keepNext w:val="0"/>
-              <w:spacing w:before="0" w:after="140" w:line="340" w:lineRule="exact"/>
+              <w:spacing w:line="340" w:lineRule="exact" w:before="0" w:after="140"/>
               <w:ind w:left="255" w:right="0" w:firstLine="0"/>
               <w:jc w:val="left"/>
             </w:pPr>
@@ -816,7 +1428,7 @@
         </w:tc>
         <w:tc>
           <w:tcPr>
-            <w:tcW w:w="397" w:type="dxa"/>
+            <w:tcW w:type="dxa" w:w="397"/>
             <w:tcMar>
               <w:top w:w="0" w:type="dxa"/>
               <w:left w:w="0" w:type="dxa"/>
@@ -827,7 +1439,7 @@
           <w:p>
             <w:pPr>
               <w:keepNext w:val="0"/>
-              <w:spacing w:before="0" w:after="140" w:line="340" w:lineRule="exact"/>
+              <w:spacing w:line="340" w:lineRule="exact" w:before="0" w:after="140"/>
               <w:ind w:left="0" w:right="0" w:firstLine="0"/>
               <w:jc w:val="right"/>
             </w:pPr>
@@ -844,28 +1456,12 @@
         </w:tc>
       </w:tr>
       <w:tr>
-        <w:tblPrEx>
-          <w:tblBorders>
-            <w:top w:val="none" w:color="auto" w:sz="0" w:space="0"/>
-            <w:left w:val="none" w:color="auto" w:sz="0" w:space="0"/>
-            <w:bottom w:val="none" w:color="auto" w:sz="0" w:space="0"/>
-            <w:right w:val="none" w:color="auto" w:sz="0" w:space="0"/>
-            <w:insideH w:val="none" w:color="auto" w:sz="0" w:space="0"/>
-            <w:insideV w:val="none" w:color="auto" w:sz="0" w:space="0"/>
-          </w:tblBorders>
-          <w:tblCellMar>
-            <w:top w:w="0" w:type="dxa"/>
-            <w:left w:w="108" w:type="dxa"/>
-            <w:bottom w:w="0" w:type="dxa"/>
-            <w:right w:w="108" w:type="dxa"/>
-          </w:tblCellMar>
-        </w:tblPrEx>
         <w:trPr>
           <w:cantSplit/>
         </w:trPr>
         <w:tc>
           <w:tcPr>
-            <w:tcW w:w="8674" w:type="dxa"/>
+            <w:tcW w:type="dxa" w:w="8674"/>
             <w:tcMar>
               <w:top w:w="0" w:type="dxa"/>
               <w:left w:w="0" w:type="dxa"/>
@@ -876,7 +1472,7 @@
           <w:p>
             <w:pPr>
               <w:keepNext w:val="0"/>
-              <w:spacing w:before="0" w:after="140" w:line="340" w:lineRule="exact"/>
+              <w:spacing w:line="340" w:lineRule="exact" w:before="0" w:after="140"/>
               <w:ind w:left="255" w:right="0" w:firstLine="0"/>
               <w:jc w:val="left"/>
             </w:pPr>
@@ -893,7 +1489,7 @@
         </w:tc>
         <w:tc>
           <w:tcPr>
-            <w:tcW w:w="397" w:type="dxa"/>
+            <w:tcW w:type="dxa" w:w="397"/>
             <w:tcMar>
               <w:top w:w="0" w:type="dxa"/>
               <w:left w:w="0" w:type="dxa"/>
@@ -904,7 +1500,7 @@
           <w:p>
             <w:pPr>
               <w:keepNext w:val="0"/>
-              <w:spacing w:before="0" w:after="140" w:line="340" w:lineRule="exact"/>
+              <w:spacing w:line="340" w:lineRule="exact" w:before="0" w:after="140"/>
               <w:ind w:left="0" w:right="0" w:firstLine="0"/>
               <w:jc w:val="right"/>
             </w:pPr>
@@ -921,28 +1517,12 @@
         </w:tc>
       </w:tr>
       <w:tr>
-        <w:tblPrEx>
-          <w:tblBorders>
-            <w:top w:val="none" w:color="auto" w:sz="0" w:space="0"/>
-            <w:left w:val="none" w:color="auto" w:sz="0" w:space="0"/>
-            <w:bottom w:val="none" w:color="auto" w:sz="0" w:space="0"/>
-            <w:right w:val="none" w:color="auto" w:sz="0" w:space="0"/>
-            <w:insideH w:val="none" w:color="auto" w:sz="0" w:space="0"/>
-            <w:insideV w:val="none" w:color="auto" w:sz="0" w:space="0"/>
-          </w:tblBorders>
-          <w:tblCellMar>
-            <w:top w:w="0" w:type="dxa"/>
-            <w:left w:w="108" w:type="dxa"/>
-            <w:bottom w:w="0" w:type="dxa"/>
-            <w:right w:w="108" w:type="dxa"/>
-          </w:tblCellMar>
-        </w:tblPrEx>
         <w:trPr>
           <w:cantSplit/>
         </w:trPr>
         <w:tc>
           <w:tcPr>
-            <w:tcW w:w="8674" w:type="dxa"/>
+            <w:tcW w:type="dxa" w:w="8674"/>
             <w:tcMar>
               <w:top w:w="0" w:type="dxa"/>
               <w:left w:w="0" w:type="dxa"/>
@@ -953,7 +1533,7 @@
           <w:p>
             <w:pPr>
               <w:keepNext w:val="0"/>
-              <w:spacing w:before="0" w:after="140" w:line="340" w:lineRule="exact"/>
+              <w:spacing w:line="340" w:lineRule="exact" w:before="0" w:after="140"/>
               <w:ind w:left="255" w:right="0" w:firstLine="0"/>
               <w:jc w:val="left"/>
             </w:pPr>
@@ -970,7 +1550,7 @@
         </w:tc>
         <w:tc>
           <w:tcPr>
-            <w:tcW w:w="397" w:type="dxa"/>
+            <w:tcW w:type="dxa" w:w="397"/>
             <w:tcMar>
               <w:top w:w="0" w:type="dxa"/>
               <w:left w:w="0" w:type="dxa"/>
@@ -981,7 +1561,7 @@
           <w:p>
             <w:pPr>
               <w:keepNext w:val="0"/>
-              <w:spacing w:before="0" w:after="140" w:line="340" w:lineRule="exact"/>
+              <w:spacing w:line="340" w:lineRule="exact" w:before="0" w:after="140"/>
               <w:ind w:left="0" w:right="0" w:firstLine="0"/>
               <w:jc w:val="right"/>
             </w:pPr>
@@ -998,28 +1578,12 @@
         </w:tc>
       </w:tr>
       <w:tr>
-        <w:tblPrEx>
-          <w:tblBorders>
-            <w:top w:val="none" w:color="auto" w:sz="0" w:space="0"/>
-            <w:left w:val="none" w:color="auto" w:sz="0" w:space="0"/>
-            <w:bottom w:val="none" w:color="auto" w:sz="0" w:space="0"/>
-            <w:right w:val="none" w:color="auto" w:sz="0" w:space="0"/>
-            <w:insideH w:val="none" w:color="auto" w:sz="0" w:space="0"/>
-            <w:insideV w:val="none" w:color="auto" w:sz="0" w:space="0"/>
-          </w:tblBorders>
-          <w:tblCellMar>
-            <w:top w:w="0" w:type="dxa"/>
-            <w:left w:w="108" w:type="dxa"/>
-            <w:bottom w:w="0" w:type="dxa"/>
-            <w:right w:w="108" w:type="dxa"/>
-          </w:tblCellMar>
-        </w:tblPrEx>
         <w:trPr>
           <w:cantSplit/>
         </w:trPr>
         <w:tc>
           <w:tcPr>
-            <w:tcW w:w="8674" w:type="dxa"/>
+            <w:tcW w:type="dxa" w:w="8674"/>
             <w:tcMar>
               <w:top w:w="0" w:type="dxa"/>
               <w:left w:w="0" w:type="dxa"/>
@@ -1030,7 +1594,7 @@
           <w:p>
             <w:pPr>
               <w:keepNext w:val="0"/>
-              <w:spacing w:before="0" w:after="140" w:line="340" w:lineRule="exact"/>
+              <w:spacing w:line="340" w:lineRule="exact" w:before="0" w:after="140"/>
               <w:ind w:left="0" w:right="0" w:firstLine="0"/>
               <w:jc w:val="left"/>
             </w:pPr>
@@ -1047,7 +1611,7 @@
         </w:tc>
         <w:tc>
           <w:tcPr>
-            <w:tcW w:w="397" w:type="dxa"/>
+            <w:tcW w:type="dxa" w:w="397"/>
             <w:tcMar>
               <w:top w:w="0" w:type="dxa"/>
               <w:left w:w="0" w:type="dxa"/>
@@ -1058,7 +1622,7 @@
           <w:p>
             <w:pPr>
               <w:keepNext w:val="0"/>
-              <w:spacing w:before="0" w:after="140" w:line="340" w:lineRule="exact"/>
+              <w:spacing w:line="340" w:lineRule="exact" w:before="0" w:after="140"/>
               <w:ind w:left="0" w:right="0" w:firstLine="0"/>
               <w:jc w:val="right"/>
             </w:pPr>
@@ -1075,28 +1639,12 @@
         </w:tc>
       </w:tr>
       <w:tr>
-        <w:tblPrEx>
-          <w:tblBorders>
-            <w:top w:val="none" w:color="auto" w:sz="0" w:space="0"/>
-            <w:left w:val="none" w:color="auto" w:sz="0" w:space="0"/>
-            <w:bottom w:val="none" w:color="auto" w:sz="0" w:space="0"/>
-            <w:right w:val="none" w:color="auto" w:sz="0" w:space="0"/>
-            <w:insideH w:val="none" w:color="auto" w:sz="0" w:space="0"/>
-            <w:insideV w:val="none" w:color="auto" w:sz="0" w:space="0"/>
-          </w:tblBorders>
-          <w:tblCellMar>
-            <w:top w:w="0" w:type="dxa"/>
-            <w:left w:w="108" w:type="dxa"/>
-            <w:bottom w:w="0" w:type="dxa"/>
-            <w:right w:w="108" w:type="dxa"/>
-          </w:tblCellMar>
-        </w:tblPrEx>
         <w:trPr>
           <w:cantSplit/>
         </w:trPr>
         <w:tc>
           <w:tcPr>
-            <w:tcW w:w="8674" w:type="dxa"/>
+            <w:tcW w:type="dxa" w:w="8674"/>
             <w:tcMar>
               <w:top w:w="0" w:type="dxa"/>
               <w:left w:w="0" w:type="dxa"/>
@@ -1107,7 +1655,7 @@
           <w:p>
             <w:pPr>
               <w:keepNext w:val="0"/>
-              <w:spacing w:before="0" w:after="140" w:line="340" w:lineRule="exact"/>
+              <w:spacing w:line="340" w:lineRule="exact" w:before="0" w:after="140"/>
               <w:ind w:left="255" w:right="0" w:firstLine="0"/>
               <w:jc w:val="left"/>
             </w:pPr>
@@ -1124,7 +1672,7 @@
         </w:tc>
         <w:tc>
           <w:tcPr>
-            <w:tcW w:w="397" w:type="dxa"/>
+            <w:tcW w:type="dxa" w:w="397"/>
             <w:tcMar>
               <w:top w:w="0" w:type="dxa"/>
               <w:left w:w="0" w:type="dxa"/>
@@ -1135,7 +1683,7 @@
           <w:p>
             <w:pPr>
               <w:keepNext w:val="0"/>
-              <w:spacing w:before="0" w:after="140" w:line="340" w:lineRule="exact"/>
+              <w:spacing w:line="340" w:lineRule="exact" w:before="0" w:after="140"/>
               <w:ind w:left="0" w:right="0" w:firstLine="0"/>
               <w:jc w:val="right"/>
             </w:pPr>
@@ -1152,28 +1700,12 @@
         </w:tc>
       </w:tr>
       <w:tr>
-        <w:tblPrEx>
-          <w:tblBorders>
-            <w:top w:val="none" w:color="auto" w:sz="0" w:space="0"/>
-            <w:left w:val="none" w:color="auto" w:sz="0" w:space="0"/>
-            <w:bottom w:val="none" w:color="auto" w:sz="0" w:space="0"/>
-            <w:right w:val="none" w:color="auto" w:sz="0" w:space="0"/>
-            <w:insideH w:val="none" w:color="auto" w:sz="0" w:space="0"/>
-            <w:insideV w:val="none" w:color="auto" w:sz="0" w:space="0"/>
-          </w:tblBorders>
-          <w:tblCellMar>
-            <w:top w:w="0" w:type="dxa"/>
-            <w:left w:w="108" w:type="dxa"/>
-            <w:bottom w:w="0" w:type="dxa"/>
-            <w:right w:w="108" w:type="dxa"/>
-          </w:tblCellMar>
-        </w:tblPrEx>
         <w:trPr>
           <w:cantSplit/>
         </w:trPr>
         <w:tc>
           <w:tcPr>
-            <w:tcW w:w="8674" w:type="dxa"/>
+            <w:tcW w:type="dxa" w:w="8674"/>
             <w:tcMar>
               <w:top w:w="0" w:type="dxa"/>
               <w:left w:w="0" w:type="dxa"/>
@@ -1184,7 +1716,7 @@
           <w:p>
             <w:pPr>
               <w:keepNext w:val="0"/>
-              <w:spacing w:before="0" w:after="140" w:line="340" w:lineRule="exact"/>
+              <w:spacing w:line="340" w:lineRule="exact" w:before="0" w:after="140"/>
               <w:ind w:left="255" w:right="0" w:firstLine="0"/>
               <w:jc w:val="left"/>
             </w:pPr>
@@ -1201,7 +1733,7 @@
         </w:tc>
         <w:tc>
           <w:tcPr>
-            <w:tcW w:w="397" w:type="dxa"/>
+            <w:tcW w:type="dxa" w:w="397"/>
             <w:tcMar>
               <w:top w:w="0" w:type="dxa"/>
               <w:left w:w="0" w:type="dxa"/>
@@ -1212,7 +1744,7 @@
           <w:p>
             <w:pPr>
               <w:keepNext w:val="0"/>
-              <w:spacing w:before="0" w:after="140" w:line="340" w:lineRule="exact"/>
+              <w:spacing w:line="340" w:lineRule="exact" w:before="0" w:after="140"/>
               <w:ind w:left="0" w:right="0" w:firstLine="0"/>
               <w:jc w:val="right"/>
             </w:pPr>
@@ -1229,28 +1761,12 @@
         </w:tc>
       </w:tr>
       <w:tr>
-        <w:tblPrEx>
-          <w:tblBorders>
-            <w:top w:val="none" w:color="auto" w:sz="0" w:space="0"/>
-            <w:left w:val="none" w:color="auto" w:sz="0" w:space="0"/>
-            <w:bottom w:val="none" w:color="auto" w:sz="0" w:space="0"/>
-            <w:right w:val="none" w:color="auto" w:sz="0" w:space="0"/>
-            <w:insideH w:val="none" w:color="auto" w:sz="0" w:space="0"/>
-            <w:insideV w:val="none" w:color="auto" w:sz="0" w:space="0"/>
-          </w:tblBorders>
-          <w:tblCellMar>
-            <w:top w:w="0" w:type="dxa"/>
-            <w:left w:w="108" w:type="dxa"/>
-            <w:bottom w:w="0" w:type="dxa"/>
-            <w:right w:w="108" w:type="dxa"/>
-          </w:tblCellMar>
-        </w:tblPrEx>
         <w:trPr>
           <w:cantSplit/>
         </w:trPr>
         <w:tc>
           <w:tcPr>
-            <w:tcW w:w="8674" w:type="dxa"/>
+            <w:tcW w:type="dxa" w:w="8674"/>
             <w:tcMar>
               <w:top w:w="0" w:type="dxa"/>
               <w:left w:w="0" w:type="dxa"/>
@@ -1261,7 +1777,7 @@
           <w:p>
             <w:pPr>
               <w:keepNext w:val="0"/>
-              <w:spacing w:before="0" w:after="140" w:line="340" w:lineRule="exact"/>
+              <w:spacing w:line="340" w:lineRule="exact" w:before="0" w:after="140"/>
               <w:ind w:left="0" w:right="0" w:firstLine="0"/>
               <w:jc w:val="left"/>
             </w:pPr>
@@ -1278,7 +1794,7 @@
         </w:tc>
         <w:tc>
           <w:tcPr>
-            <w:tcW w:w="397" w:type="dxa"/>
+            <w:tcW w:type="dxa" w:w="397"/>
             <w:tcMar>
               <w:top w:w="0" w:type="dxa"/>
               <w:left w:w="0" w:type="dxa"/>
@@ -1289,7 +1805,7 @@
           <w:p>
             <w:pPr>
               <w:keepNext w:val="0"/>
-              <w:spacing w:before="0" w:after="140" w:line="340" w:lineRule="exact"/>
+              <w:spacing w:line="340" w:lineRule="exact" w:before="0" w:after="140"/>
               <w:ind w:left="0" w:right="0" w:firstLine="0"/>
               <w:jc w:val="right"/>
             </w:pPr>
@@ -1306,28 +1822,12 @@
         </w:tc>
       </w:tr>
       <w:tr>
-        <w:tblPrEx>
-          <w:tblBorders>
-            <w:top w:val="none" w:color="auto" w:sz="0" w:space="0"/>
-            <w:left w:val="none" w:color="auto" w:sz="0" w:space="0"/>
-            <w:bottom w:val="none" w:color="auto" w:sz="0" w:space="0"/>
-            <w:right w:val="none" w:color="auto" w:sz="0" w:space="0"/>
-            <w:insideH w:val="none" w:color="auto" w:sz="0" w:space="0"/>
-            <w:insideV w:val="none" w:color="auto" w:sz="0" w:space="0"/>
-          </w:tblBorders>
-          <w:tblCellMar>
-            <w:top w:w="0" w:type="dxa"/>
-            <w:left w:w="108" w:type="dxa"/>
-            <w:bottom w:w="0" w:type="dxa"/>
-            <w:right w:w="108" w:type="dxa"/>
-          </w:tblCellMar>
-        </w:tblPrEx>
         <w:trPr>
           <w:cantSplit/>
         </w:trPr>
         <w:tc>
           <w:tcPr>
-            <w:tcW w:w="8674" w:type="dxa"/>
+            <w:tcW w:type="dxa" w:w="8674"/>
             <w:tcMar>
               <w:top w:w="0" w:type="dxa"/>
               <w:left w:w="0" w:type="dxa"/>
@@ -1338,7 +1838,7 @@
           <w:p>
             <w:pPr>
               <w:keepNext w:val="0"/>
-              <w:spacing w:before="0" w:after="140" w:line="340" w:lineRule="exact"/>
+              <w:spacing w:line="340" w:lineRule="exact" w:before="0" w:after="140"/>
               <w:ind w:left="255" w:right="0" w:firstLine="0"/>
               <w:jc w:val="left"/>
             </w:pPr>
@@ -1355,7 +1855,7 @@
         </w:tc>
         <w:tc>
           <w:tcPr>
-            <w:tcW w:w="397" w:type="dxa"/>
+            <w:tcW w:type="dxa" w:w="397"/>
             <w:tcMar>
               <w:top w:w="0" w:type="dxa"/>
               <w:left w:w="0" w:type="dxa"/>
@@ -1366,7 +1866,7 @@
           <w:p>
             <w:pPr>
               <w:keepNext w:val="0"/>
-              <w:spacing w:before="0" w:after="140" w:line="340" w:lineRule="exact"/>
+              <w:spacing w:line="340" w:lineRule="exact" w:before="0" w:after="140"/>
               <w:ind w:left="0" w:right="0" w:firstLine="0"/>
               <w:jc w:val="right"/>
             </w:pPr>
@@ -1383,28 +1883,12 @@
         </w:tc>
       </w:tr>
       <w:tr>
-        <w:tblPrEx>
-          <w:tblBorders>
-            <w:top w:val="none" w:color="auto" w:sz="0" w:space="0"/>
-            <w:left w:val="none" w:color="auto" w:sz="0" w:space="0"/>
-            <w:bottom w:val="none" w:color="auto" w:sz="0" w:space="0"/>
-            <w:right w:val="none" w:color="auto" w:sz="0" w:space="0"/>
-            <w:insideH w:val="none" w:color="auto" w:sz="0" w:space="0"/>
-            <w:insideV w:val="none" w:color="auto" w:sz="0" w:space="0"/>
-          </w:tblBorders>
-          <w:tblCellMar>
-            <w:top w:w="0" w:type="dxa"/>
-            <w:left w:w="108" w:type="dxa"/>
-            <w:bottom w:w="0" w:type="dxa"/>
-            <w:right w:w="108" w:type="dxa"/>
-          </w:tblCellMar>
-        </w:tblPrEx>
         <w:trPr>
           <w:cantSplit/>
         </w:trPr>
         <w:tc>
           <w:tcPr>
-            <w:tcW w:w="8674" w:type="dxa"/>
+            <w:tcW w:type="dxa" w:w="8674"/>
             <w:tcMar>
               <w:top w:w="0" w:type="dxa"/>
               <w:left w:w="0" w:type="dxa"/>
@@ -1415,7 +1899,7 @@
           <w:p>
             <w:pPr>
               <w:keepNext w:val="0"/>
-              <w:spacing w:before="0" w:after="140" w:line="340" w:lineRule="exact"/>
+              <w:spacing w:line="340" w:lineRule="exact" w:before="0" w:after="140"/>
               <w:ind w:left="255" w:right="0" w:firstLine="0"/>
               <w:jc w:val="left"/>
             </w:pPr>
@@ -1432,7 +1916,7 @@
         </w:tc>
         <w:tc>
           <w:tcPr>
-            <w:tcW w:w="397" w:type="dxa"/>
+            <w:tcW w:type="dxa" w:w="397"/>
             <w:tcMar>
               <w:top w:w="0" w:type="dxa"/>
               <w:left w:w="0" w:type="dxa"/>
@@ -1443,7 +1927,7 @@
           <w:p>
             <w:pPr>
               <w:keepNext w:val="0"/>
-              <w:spacing w:before="0" w:after="140" w:line="340" w:lineRule="exact"/>
+              <w:spacing w:line="340" w:lineRule="exact" w:before="0" w:after="140"/>
               <w:ind w:left="0" w:right="0" w:firstLine="0"/>
               <w:jc w:val="right"/>
             </w:pPr>
@@ -1460,28 +1944,12 @@
         </w:tc>
       </w:tr>
       <w:tr>
-        <w:tblPrEx>
-          <w:tblBorders>
-            <w:top w:val="none" w:color="auto" w:sz="0" w:space="0"/>
-            <w:left w:val="none" w:color="auto" w:sz="0" w:space="0"/>
-            <w:bottom w:val="none" w:color="auto" w:sz="0" w:space="0"/>
-            <w:right w:val="none" w:color="auto" w:sz="0" w:space="0"/>
-            <w:insideH w:val="none" w:color="auto" w:sz="0" w:space="0"/>
-            <w:insideV w:val="none" w:color="auto" w:sz="0" w:space="0"/>
-          </w:tblBorders>
-          <w:tblCellMar>
-            <w:top w:w="0" w:type="dxa"/>
-            <w:left w:w="108" w:type="dxa"/>
-            <w:bottom w:w="0" w:type="dxa"/>
-            <w:right w:w="108" w:type="dxa"/>
-          </w:tblCellMar>
-        </w:tblPrEx>
         <w:trPr>
           <w:cantSplit/>
         </w:trPr>
         <w:tc>
           <w:tcPr>
-            <w:tcW w:w="8674" w:type="dxa"/>
+            <w:tcW w:type="dxa" w:w="8674"/>
             <w:tcMar>
               <w:top w:w="0" w:type="dxa"/>
               <w:left w:w="0" w:type="dxa"/>
@@ -1492,7 +1960,7 @@
           <w:p>
             <w:pPr>
               <w:keepNext w:val="0"/>
-              <w:spacing w:before="0" w:after="140" w:line="340" w:lineRule="exact"/>
+              <w:spacing w:line="340" w:lineRule="exact" w:before="0" w:after="140"/>
               <w:ind w:left="0" w:right="0" w:firstLine="0"/>
               <w:jc w:val="left"/>
             </w:pPr>
@@ -1509,7 +1977,7 @@
         </w:tc>
         <w:tc>
           <w:tcPr>
-            <w:tcW w:w="397" w:type="dxa"/>
+            <w:tcW w:type="dxa" w:w="397"/>
             <w:tcMar>
               <w:top w:w="0" w:type="dxa"/>
               <w:left w:w="0" w:type="dxa"/>
@@ -1520,7 +1988,7 @@
           <w:p>
             <w:pPr>
               <w:keepNext w:val="0"/>
-              <w:spacing w:before="0" w:after="140" w:line="340" w:lineRule="exact"/>
+              <w:spacing w:line="340" w:lineRule="exact" w:before="0" w:after="140"/>
               <w:ind w:left="0" w:right="0" w:firstLine="0"/>
               <w:jc w:val="right"/>
             </w:pPr>
@@ -1537,28 +2005,12 @@
         </w:tc>
       </w:tr>
       <w:tr>
-        <w:tblPrEx>
-          <w:tblBorders>
-            <w:top w:val="none" w:color="auto" w:sz="0" w:space="0"/>
-            <w:left w:val="none" w:color="auto" w:sz="0" w:space="0"/>
-            <w:bottom w:val="none" w:color="auto" w:sz="0" w:space="0"/>
-            <w:right w:val="none" w:color="auto" w:sz="0" w:space="0"/>
-            <w:insideH w:val="none" w:color="auto" w:sz="0" w:space="0"/>
-            <w:insideV w:val="none" w:color="auto" w:sz="0" w:space="0"/>
-          </w:tblBorders>
-          <w:tblCellMar>
-            <w:top w:w="0" w:type="dxa"/>
-            <w:left w:w="108" w:type="dxa"/>
-            <w:bottom w:w="0" w:type="dxa"/>
-            <w:right w:w="108" w:type="dxa"/>
-          </w:tblCellMar>
-        </w:tblPrEx>
         <w:trPr>
           <w:cantSplit/>
         </w:trPr>
         <w:tc>
           <w:tcPr>
-            <w:tcW w:w="8674" w:type="dxa"/>
+            <w:tcW w:type="dxa" w:w="8674"/>
             <w:tcMar>
               <w:top w:w="0" w:type="dxa"/>
               <w:left w:w="0" w:type="dxa"/>
@@ -1569,7 +2021,7 @@
           <w:p>
             <w:pPr>
               <w:keepNext w:val="0"/>
-              <w:spacing w:before="0" w:after="140" w:line="340" w:lineRule="exact"/>
+              <w:spacing w:line="340" w:lineRule="exact" w:before="0" w:after="140"/>
               <w:ind w:left="255" w:right="0" w:firstLine="0"/>
               <w:jc w:val="left"/>
             </w:pPr>
@@ -1586,7 +2038,7 @@
         </w:tc>
         <w:tc>
           <w:tcPr>
-            <w:tcW w:w="397" w:type="dxa"/>
+            <w:tcW w:type="dxa" w:w="397"/>
             <w:tcMar>
               <w:top w:w="0" w:type="dxa"/>
               <w:left w:w="0" w:type="dxa"/>
@@ -1597,7 +2049,7 @@
           <w:p>
             <w:pPr>
               <w:keepNext w:val="0"/>
-              <w:spacing w:before="0" w:after="140" w:line="340" w:lineRule="exact"/>
+              <w:spacing w:line="340" w:lineRule="exact" w:before="0" w:after="140"/>
               <w:ind w:left="0" w:right="0" w:firstLine="0"/>
               <w:jc w:val="right"/>
             </w:pPr>
@@ -1614,28 +2066,12 @@
         </w:tc>
       </w:tr>
       <w:tr>
-        <w:tblPrEx>
-          <w:tblBorders>
-            <w:top w:val="none" w:color="auto" w:sz="0" w:space="0"/>
-            <w:left w:val="none" w:color="auto" w:sz="0" w:space="0"/>
-            <w:bottom w:val="none" w:color="auto" w:sz="0" w:space="0"/>
-            <w:right w:val="none" w:color="auto" w:sz="0" w:space="0"/>
-            <w:insideH w:val="none" w:color="auto" w:sz="0" w:space="0"/>
-            <w:insideV w:val="none" w:color="auto" w:sz="0" w:space="0"/>
-          </w:tblBorders>
-          <w:tblCellMar>
-            <w:top w:w="0" w:type="dxa"/>
-            <w:left w:w="108" w:type="dxa"/>
-            <w:bottom w:w="0" w:type="dxa"/>
-            <w:right w:w="108" w:type="dxa"/>
-          </w:tblCellMar>
-        </w:tblPrEx>
         <w:trPr>
           <w:cantSplit/>
         </w:trPr>
         <w:tc>
           <w:tcPr>
-            <w:tcW w:w="8674" w:type="dxa"/>
+            <w:tcW w:type="dxa" w:w="8674"/>
             <w:tcMar>
               <w:top w:w="0" w:type="dxa"/>
               <w:left w:w="0" w:type="dxa"/>
@@ -1646,7 +2082,7 @@
           <w:p>
             <w:pPr>
               <w:keepNext w:val="0"/>
-              <w:spacing w:before="0" w:after="140" w:line="340" w:lineRule="exact"/>
+              <w:spacing w:line="340" w:lineRule="exact" w:before="0" w:after="140"/>
               <w:ind w:left="255" w:right="0" w:firstLine="0"/>
               <w:jc w:val="left"/>
             </w:pPr>
@@ -1663,7 +2099,7 @@
         </w:tc>
         <w:tc>
           <w:tcPr>
-            <w:tcW w:w="397" w:type="dxa"/>
+            <w:tcW w:type="dxa" w:w="397"/>
             <w:tcMar>
               <w:top w:w="0" w:type="dxa"/>
               <w:left w:w="0" w:type="dxa"/>
@@ -1674,7 +2110,7 @@
           <w:p>
             <w:pPr>
               <w:keepNext w:val="0"/>
-              <w:spacing w:before="0" w:after="140" w:line="340" w:lineRule="exact"/>
+              <w:spacing w:line="340" w:lineRule="exact" w:before="0" w:after="140"/>
               <w:ind w:left="0" w:right="0" w:firstLine="0"/>
               <w:jc w:val="right"/>
             </w:pPr>
@@ -1691,28 +2127,12 @@
         </w:tc>
       </w:tr>
       <w:tr>
-        <w:tblPrEx>
-          <w:tblBorders>
-            <w:top w:val="none" w:color="auto" w:sz="0" w:space="0"/>
-            <w:left w:val="none" w:color="auto" w:sz="0" w:space="0"/>
-            <w:bottom w:val="none" w:color="auto" w:sz="0" w:space="0"/>
-            <w:right w:val="none" w:color="auto" w:sz="0" w:space="0"/>
-            <w:insideH w:val="none" w:color="auto" w:sz="0" w:space="0"/>
-            <w:insideV w:val="none" w:color="auto" w:sz="0" w:space="0"/>
-          </w:tblBorders>
-          <w:tblCellMar>
-            <w:top w:w="0" w:type="dxa"/>
-            <w:left w:w="108" w:type="dxa"/>
-            <w:bottom w:w="0" w:type="dxa"/>
-            <w:right w:w="108" w:type="dxa"/>
-          </w:tblCellMar>
-        </w:tblPrEx>
         <w:trPr>
           <w:cantSplit/>
         </w:trPr>
         <w:tc>
           <w:tcPr>
-            <w:tcW w:w="8674" w:type="dxa"/>
+            <w:tcW w:type="dxa" w:w="8674"/>
             <w:tcMar>
               <w:top w:w="0" w:type="dxa"/>
               <w:left w:w="0" w:type="dxa"/>
@@ -1723,7 +2143,7 @@
           <w:p>
             <w:pPr>
               <w:keepNext w:val="0"/>
-              <w:spacing w:before="0" w:after="140" w:line="340" w:lineRule="exact"/>
+              <w:spacing w:line="340" w:lineRule="exact" w:before="0" w:after="140"/>
               <w:ind w:left="255" w:right="0" w:firstLine="0"/>
               <w:jc w:val="left"/>
             </w:pPr>
@@ -1740,7 +2160,7 @@
         </w:tc>
         <w:tc>
           <w:tcPr>
-            <w:tcW w:w="397" w:type="dxa"/>
+            <w:tcW w:type="dxa" w:w="397"/>
             <w:tcMar>
               <w:top w:w="0" w:type="dxa"/>
               <w:left w:w="0" w:type="dxa"/>
@@ -1751,7 +2171,7 @@
           <w:p>
             <w:pPr>
               <w:keepNext w:val="0"/>
-              <w:spacing w:before="0" w:after="140" w:line="340" w:lineRule="exact"/>
+              <w:spacing w:line="340" w:lineRule="exact" w:before="0" w:after="140"/>
               <w:ind w:left="0" w:right="0" w:firstLine="0"/>
               <w:jc w:val="right"/>
             </w:pPr>
@@ -1768,28 +2188,12 @@
         </w:tc>
       </w:tr>
       <w:tr>
-        <w:tblPrEx>
-          <w:tblBorders>
-            <w:top w:val="none" w:color="auto" w:sz="0" w:space="0"/>
-            <w:left w:val="none" w:color="auto" w:sz="0" w:space="0"/>
-            <w:bottom w:val="none" w:color="auto" w:sz="0" w:space="0"/>
-            <w:right w:val="none" w:color="auto" w:sz="0" w:space="0"/>
-            <w:insideH w:val="none" w:color="auto" w:sz="0" w:space="0"/>
-            <w:insideV w:val="none" w:color="auto" w:sz="0" w:space="0"/>
-          </w:tblBorders>
-          <w:tblCellMar>
-            <w:top w:w="0" w:type="dxa"/>
-            <w:left w:w="108" w:type="dxa"/>
-            <w:bottom w:w="0" w:type="dxa"/>
-            <w:right w:w="108" w:type="dxa"/>
-          </w:tblCellMar>
-        </w:tblPrEx>
         <w:trPr>
           <w:cantSplit/>
         </w:trPr>
         <w:tc>
           <w:tcPr>
-            <w:tcW w:w="8674" w:type="dxa"/>
+            <w:tcW w:type="dxa" w:w="8674"/>
             <w:tcMar>
               <w:top w:w="0" w:type="dxa"/>
               <w:left w:w="0" w:type="dxa"/>
@@ -1800,7 +2204,7 @@
           <w:p>
             <w:pPr>
               <w:keepNext w:val="0"/>
-              <w:spacing w:before="0" w:after="140" w:line="340" w:lineRule="exact"/>
+              <w:spacing w:line="340" w:lineRule="exact" w:before="0" w:after="140"/>
               <w:ind w:left="0" w:right="0" w:firstLine="0"/>
               <w:jc w:val="left"/>
             </w:pPr>
@@ -1817,7 +2221,7 @@
         </w:tc>
         <w:tc>
           <w:tcPr>
-            <w:tcW w:w="397" w:type="dxa"/>
+            <w:tcW w:type="dxa" w:w="397"/>
             <w:tcMar>
               <w:top w:w="0" w:type="dxa"/>
               <w:left w:w="0" w:type="dxa"/>
@@ -1828,7 +2232,7 @@
           <w:p>
             <w:pPr>
               <w:keepNext w:val="0"/>
-              <w:spacing w:before="0" w:after="140" w:line="340" w:lineRule="exact"/>
+              <w:spacing w:line="340" w:lineRule="exact" w:before="0" w:after="140"/>
               <w:ind w:left="0" w:right="0" w:firstLine="0"/>
               <w:jc w:val="right"/>
             </w:pPr>
@@ -1845,28 +2249,12 @@
         </w:tc>
       </w:tr>
       <w:tr>
-        <w:tblPrEx>
-          <w:tblBorders>
-            <w:top w:val="none" w:color="auto" w:sz="0" w:space="0"/>
-            <w:left w:val="none" w:color="auto" w:sz="0" w:space="0"/>
-            <w:bottom w:val="none" w:color="auto" w:sz="0" w:space="0"/>
-            <w:right w:val="none" w:color="auto" w:sz="0" w:space="0"/>
-            <w:insideH w:val="none" w:color="auto" w:sz="0" w:space="0"/>
-            <w:insideV w:val="none" w:color="auto" w:sz="0" w:space="0"/>
-          </w:tblBorders>
-          <w:tblCellMar>
-            <w:top w:w="0" w:type="dxa"/>
-            <w:left w:w="108" w:type="dxa"/>
-            <w:bottom w:w="0" w:type="dxa"/>
-            <w:right w:w="108" w:type="dxa"/>
-          </w:tblCellMar>
-        </w:tblPrEx>
         <w:trPr>
           <w:cantSplit/>
         </w:trPr>
         <w:tc>
           <w:tcPr>
-            <w:tcW w:w="8674" w:type="dxa"/>
+            <w:tcW w:type="dxa" w:w="8674"/>
             <w:tcMar>
               <w:top w:w="0" w:type="dxa"/>
               <w:left w:w="0" w:type="dxa"/>
@@ -1877,7 +2265,7 @@
           <w:p>
             <w:pPr>
               <w:keepNext w:val="0"/>
-              <w:spacing w:before="0" w:after="140" w:line="340" w:lineRule="exact"/>
+              <w:spacing w:line="340" w:lineRule="exact" w:before="0" w:after="140"/>
               <w:ind w:left="255" w:right="0" w:firstLine="0"/>
               <w:jc w:val="left"/>
             </w:pPr>
@@ -1894,7 +2282,7 @@
         </w:tc>
         <w:tc>
           <w:tcPr>
-            <w:tcW w:w="397" w:type="dxa"/>
+            <w:tcW w:type="dxa" w:w="397"/>
             <w:tcMar>
               <w:top w:w="0" w:type="dxa"/>
               <w:left w:w="0" w:type="dxa"/>
@@ -1905,7 +2293,7 @@
           <w:p>
             <w:pPr>
               <w:keepNext w:val="0"/>
-              <w:spacing w:before="0" w:after="140" w:line="340" w:lineRule="exact"/>
+              <w:spacing w:line="340" w:lineRule="exact" w:before="0" w:after="140"/>
               <w:ind w:left="0" w:right="0" w:firstLine="0"/>
               <w:jc w:val="right"/>
             </w:pPr>
@@ -1922,28 +2310,12 @@
         </w:tc>
       </w:tr>
       <w:tr>
-        <w:tblPrEx>
-          <w:tblBorders>
-            <w:top w:val="none" w:color="auto" w:sz="0" w:space="0"/>
-            <w:left w:val="none" w:color="auto" w:sz="0" w:space="0"/>
-            <w:bottom w:val="none" w:color="auto" w:sz="0" w:space="0"/>
-            <w:right w:val="none" w:color="auto" w:sz="0" w:space="0"/>
-            <w:insideH w:val="none" w:color="auto" w:sz="0" w:space="0"/>
-            <w:insideV w:val="none" w:color="auto" w:sz="0" w:space="0"/>
-          </w:tblBorders>
-          <w:tblCellMar>
-            <w:top w:w="0" w:type="dxa"/>
-            <w:left w:w="108" w:type="dxa"/>
-            <w:bottom w:w="0" w:type="dxa"/>
-            <w:right w:w="108" w:type="dxa"/>
-          </w:tblCellMar>
-        </w:tblPrEx>
         <w:trPr>
           <w:cantSplit/>
         </w:trPr>
         <w:tc>
           <w:tcPr>
-            <w:tcW w:w="8674" w:type="dxa"/>
+            <w:tcW w:type="dxa" w:w="8674"/>
             <w:tcMar>
               <w:top w:w="0" w:type="dxa"/>
               <w:left w:w="0" w:type="dxa"/>
@@ -1954,7 +2326,7 @@
           <w:p>
             <w:pPr>
               <w:keepNext w:val="0"/>
-              <w:spacing w:before="0" w:after="140" w:line="340" w:lineRule="exact"/>
+              <w:spacing w:line="340" w:lineRule="exact" w:before="0" w:after="140"/>
               <w:ind w:left="255" w:right="0" w:firstLine="0"/>
               <w:jc w:val="left"/>
             </w:pPr>
@@ -1971,7 +2343,7 @@
         </w:tc>
         <w:tc>
           <w:tcPr>
-            <w:tcW w:w="397" w:type="dxa"/>
+            <w:tcW w:type="dxa" w:w="397"/>
             <w:tcMar>
               <w:top w:w="0" w:type="dxa"/>
               <w:left w:w="0" w:type="dxa"/>
@@ -1982,7 +2354,7 @@
           <w:p>
             <w:pPr>
               <w:keepNext w:val="0"/>
-              <w:spacing w:before="0" w:after="140" w:line="340" w:lineRule="exact"/>
+              <w:spacing w:line="340" w:lineRule="exact" w:before="0" w:after="140"/>
               <w:ind w:left="0" w:right="0" w:firstLine="0"/>
               <w:jc w:val="right"/>
             </w:pPr>
@@ -1999,28 +2371,12 @@
         </w:tc>
       </w:tr>
       <w:tr>
-        <w:tblPrEx>
-          <w:tblBorders>
-            <w:top w:val="none" w:color="auto" w:sz="0" w:space="0"/>
-            <w:left w:val="none" w:color="auto" w:sz="0" w:space="0"/>
-            <w:bottom w:val="none" w:color="auto" w:sz="0" w:space="0"/>
-            <w:right w:val="none" w:color="auto" w:sz="0" w:space="0"/>
-            <w:insideH w:val="none" w:color="auto" w:sz="0" w:space="0"/>
-            <w:insideV w:val="none" w:color="auto" w:sz="0" w:space="0"/>
-          </w:tblBorders>
-          <w:tblCellMar>
-            <w:top w:w="0" w:type="dxa"/>
-            <w:left w:w="108" w:type="dxa"/>
-            <w:bottom w:w="0" w:type="dxa"/>
-            <w:right w:w="108" w:type="dxa"/>
-          </w:tblCellMar>
-        </w:tblPrEx>
         <w:trPr>
           <w:cantSplit/>
         </w:trPr>
         <w:tc>
           <w:tcPr>
-            <w:tcW w:w="8674" w:type="dxa"/>
+            <w:tcW w:type="dxa" w:w="8674"/>
             <w:tcMar>
               <w:top w:w="0" w:type="dxa"/>
               <w:left w:w="0" w:type="dxa"/>
@@ -2031,7 +2387,7 @@
           <w:p>
             <w:pPr>
               <w:keepNext w:val="0"/>
-              <w:spacing w:before="0" w:after="140" w:line="340" w:lineRule="exact"/>
+              <w:spacing w:line="340" w:lineRule="exact" w:before="0" w:after="140"/>
               <w:ind w:left="0" w:right="0" w:firstLine="0"/>
               <w:jc w:val="left"/>
             </w:pPr>
@@ -2048,7 +2404,7 @@
         </w:tc>
         <w:tc>
           <w:tcPr>
-            <w:tcW w:w="397" w:type="dxa"/>
+            <w:tcW w:type="dxa" w:w="397"/>
             <w:tcMar>
               <w:top w:w="0" w:type="dxa"/>
               <w:left w:w="0" w:type="dxa"/>
@@ -2059,7 +2415,7 @@
           <w:p>
             <w:pPr>
               <w:keepNext w:val="0"/>
-              <w:spacing w:before="0" w:after="140" w:line="340" w:lineRule="exact"/>
+              <w:spacing w:line="340" w:lineRule="exact" w:before="0" w:after="140"/>
               <w:ind w:left="0" w:right="0" w:firstLine="0"/>
               <w:jc w:val="right"/>
             </w:pPr>
@@ -2076,28 +2432,12 @@
         </w:tc>
       </w:tr>
       <w:tr>
-        <w:tblPrEx>
-          <w:tblBorders>
-            <w:top w:val="none" w:color="auto" w:sz="0" w:space="0"/>
-            <w:left w:val="none" w:color="auto" w:sz="0" w:space="0"/>
-            <w:bottom w:val="none" w:color="auto" w:sz="0" w:space="0"/>
-            <w:right w:val="none" w:color="auto" w:sz="0" w:space="0"/>
-            <w:insideH w:val="none" w:color="auto" w:sz="0" w:space="0"/>
-            <w:insideV w:val="none" w:color="auto" w:sz="0" w:space="0"/>
-          </w:tblBorders>
-          <w:tblCellMar>
-            <w:top w:w="0" w:type="dxa"/>
-            <w:left w:w="108" w:type="dxa"/>
-            <w:bottom w:w="0" w:type="dxa"/>
-            <w:right w:w="108" w:type="dxa"/>
-          </w:tblCellMar>
-        </w:tblPrEx>
         <w:trPr>
           <w:cantSplit/>
         </w:trPr>
         <w:tc>
           <w:tcPr>
-            <w:tcW w:w="8674" w:type="dxa"/>
+            <w:tcW w:type="dxa" w:w="8674"/>
             <w:tcMar>
               <w:top w:w="0" w:type="dxa"/>
               <w:left w:w="0" w:type="dxa"/>
@@ -2108,7 +2448,7 @@
           <w:p>
             <w:pPr>
               <w:keepNext w:val="0"/>
-              <w:spacing w:before="0" w:after="140" w:line="340" w:lineRule="exact"/>
+              <w:spacing w:line="340" w:lineRule="exact" w:before="0" w:after="140"/>
               <w:ind w:left="255" w:right="0" w:firstLine="0"/>
               <w:jc w:val="left"/>
             </w:pPr>
@@ -2125,7 +2465,7 @@
         </w:tc>
         <w:tc>
           <w:tcPr>
-            <w:tcW w:w="397" w:type="dxa"/>
+            <w:tcW w:type="dxa" w:w="397"/>
             <w:tcMar>
               <w:top w:w="0" w:type="dxa"/>
               <w:left w:w="0" w:type="dxa"/>
@@ -2136,7 +2476,7 @@
           <w:p>
             <w:pPr>
               <w:keepNext w:val="0"/>
-              <w:spacing w:before="0" w:after="140" w:line="340" w:lineRule="exact"/>
+              <w:spacing w:line="340" w:lineRule="exact" w:before="0" w:after="140"/>
               <w:ind w:left="0" w:right="0" w:firstLine="0"/>
               <w:jc w:val="right"/>
             </w:pPr>
@@ -2153,28 +2493,12 @@
         </w:tc>
       </w:tr>
       <w:tr>
-        <w:tblPrEx>
-          <w:tblBorders>
-            <w:top w:val="none" w:color="auto" w:sz="0" w:space="0"/>
-            <w:left w:val="none" w:color="auto" w:sz="0" w:space="0"/>
-            <w:bottom w:val="none" w:color="auto" w:sz="0" w:space="0"/>
-            <w:right w:val="none" w:color="auto" w:sz="0" w:space="0"/>
-            <w:insideH w:val="none" w:color="auto" w:sz="0" w:space="0"/>
-            <w:insideV w:val="none" w:color="auto" w:sz="0" w:space="0"/>
-          </w:tblBorders>
-          <w:tblCellMar>
-            <w:top w:w="0" w:type="dxa"/>
-            <w:left w:w="108" w:type="dxa"/>
-            <w:bottom w:w="0" w:type="dxa"/>
-            <w:right w:w="108" w:type="dxa"/>
-          </w:tblCellMar>
-        </w:tblPrEx>
         <w:trPr>
           <w:cantSplit/>
         </w:trPr>
         <w:tc>
           <w:tcPr>
-            <w:tcW w:w="8674" w:type="dxa"/>
+            <w:tcW w:type="dxa" w:w="8674"/>
             <w:tcMar>
               <w:top w:w="0" w:type="dxa"/>
               <w:left w:w="0" w:type="dxa"/>
@@ -2185,7 +2509,7 @@
           <w:p>
             <w:pPr>
               <w:keepNext w:val="0"/>
-              <w:spacing w:before="0" w:after="140" w:line="340" w:lineRule="exact"/>
+              <w:spacing w:line="340" w:lineRule="exact" w:before="0" w:after="140"/>
               <w:ind w:left="255" w:right="0" w:firstLine="0"/>
               <w:jc w:val="left"/>
             </w:pPr>
@@ -2202,7 +2526,7 @@
         </w:tc>
         <w:tc>
           <w:tcPr>
-            <w:tcW w:w="397" w:type="dxa"/>
+            <w:tcW w:type="dxa" w:w="397"/>
             <w:tcMar>
               <w:top w:w="0" w:type="dxa"/>
               <w:left w:w="0" w:type="dxa"/>
@@ -2213,7 +2537,7 @@
           <w:p>
             <w:pPr>
               <w:keepNext w:val="0"/>
-              <w:spacing w:before="0" w:after="140" w:line="340" w:lineRule="exact"/>
+              <w:spacing w:line="340" w:lineRule="exact" w:before="0" w:after="140"/>
               <w:ind w:left="0" w:right="0" w:firstLine="0"/>
               <w:jc w:val="right"/>
             </w:pPr>
@@ -2230,28 +2554,12 @@
         </w:tc>
       </w:tr>
       <w:tr>
-        <w:tblPrEx>
-          <w:tblBorders>
-            <w:top w:val="none" w:color="auto" w:sz="0" w:space="0"/>
-            <w:left w:val="none" w:color="auto" w:sz="0" w:space="0"/>
-            <w:bottom w:val="none" w:color="auto" w:sz="0" w:space="0"/>
-            <w:right w:val="none" w:color="auto" w:sz="0" w:space="0"/>
-            <w:insideH w:val="none" w:color="auto" w:sz="0" w:space="0"/>
-            <w:insideV w:val="none" w:color="auto" w:sz="0" w:space="0"/>
-          </w:tblBorders>
-          <w:tblCellMar>
-            <w:top w:w="0" w:type="dxa"/>
-            <w:left w:w="108" w:type="dxa"/>
-            <w:bottom w:w="0" w:type="dxa"/>
-            <w:right w:w="108" w:type="dxa"/>
-          </w:tblCellMar>
-        </w:tblPrEx>
         <w:trPr>
           <w:cantSplit/>
         </w:trPr>
         <w:tc>
           <w:tcPr>
-            <w:tcW w:w="8674" w:type="dxa"/>
+            <w:tcW w:type="dxa" w:w="8674"/>
             <w:tcMar>
               <w:top w:w="0" w:type="dxa"/>
               <w:left w:w="0" w:type="dxa"/>
@@ -2262,7 +2570,7 @@
           <w:p>
             <w:pPr>
               <w:keepNext w:val="0"/>
-              <w:spacing w:before="0" w:after="140" w:line="340" w:lineRule="exact"/>
+              <w:spacing w:line="340" w:lineRule="exact" w:before="0" w:after="140"/>
               <w:ind w:left="255" w:right="0" w:firstLine="0"/>
               <w:jc w:val="left"/>
             </w:pPr>
@@ -2279,7 +2587,7 @@
         </w:tc>
         <w:tc>
           <w:tcPr>
-            <w:tcW w:w="397" w:type="dxa"/>
+            <w:tcW w:type="dxa" w:w="397"/>
             <w:tcMar>
               <w:top w:w="0" w:type="dxa"/>
               <w:left w:w="0" w:type="dxa"/>
@@ -2290,7 +2598,7 @@
           <w:p>
             <w:pPr>
               <w:keepNext w:val="0"/>
-              <w:spacing w:before="0" w:after="140" w:line="340" w:lineRule="exact"/>
+              <w:spacing w:line="340" w:lineRule="exact" w:before="0" w:after="140"/>
               <w:ind w:left="0" w:right="0" w:firstLine="0"/>
               <w:jc w:val="right"/>
             </w:pPr>
@@ -2307,28 +2615,12 @@
         </w:tc>
       </w:tr>
       <w:tr>
-        <w:tblPrEx>
-          <w:tblBorders>
-            <w:top w:val="none" w:color="auto" w:sz="0" w:space="0"/>
-            <w:left w:val="none" w:color="auto" w:sz="0" w:space="0"/>
-            <w:bottom w:val="none" w:color="auto" w:sz="0" w:space="0"/>
-            <w:right w:val="none" w:color="auto" w:sz="0" w:space="0"/>
-            <w:insideH w:val="none" w:color="auto" w:sz="0" w:space="0"/>
-            <w:insideV w:val="none" w:color="auto" w:sz="0" w:space="0"/>
-          </w:tblBorders>
-          <w:tblCellMar>
-            <w:top w:w="0" w:type="dxa"/>
-            <w:left w:w="108" w:type="dxa"/>
-            <w:bottom w:w="0" w:type="dxa"/>
-            <w:right w:w="108" w:type="dxa"/>
-          </w:tblCellMar>
-        </w:tblPrEx>
         <w:trPr>
           <w:cantSplit/>
         </w:trPr>
         <w:tc>
           <w:tcPr>
-            <w:tcW w:w="8674" w:type="dxa"/>
+            <w:tcW w:type="dxa" w:w="8674"/>
             <w:tcMar>
               <w:top w:w="0" w:type="dxa"/>
               <w:left w:w="0" w:type="dxa"/>
@@ -2339,7 +2631,7 @@
           <w:p>
             <w:pPr>
               <w:keepNext w:val="0"/>
-              <w:spacing w:before="0" w:after="140" w:line="340" w:lineRule="exact"/>
+              <w:spacing w:line="340" w:lineRule="exact" w:before="0" w:after="140"/>
               <w:ind w:left="0" w:right="0" w:firstLine="0"/>
               <w:jc w:val="left"/>
             </w:pPr>
@@ -2356,7 +2648,7 @@
         </w:tc>
         <w:tc>
           <w:tcPr>
-            <w:tcW w:w="397" w:type="dxa"/>
+            <w:tcW w:type="dxa" w:w="397"/>
             <w:tcMar>
               <w:top w:w="0" w:type="dxa"/>
               <w:left w:w="0" w:type="dxa"/>
@@ -2367,7 +2659,7 @@
           <w:p>
             <w:pPr>
               <w:keepNext w:val="0"/>
-              <w:spacing w:before="0" w:after="140" w:line="340" w:lineRule="exact"/>
+              <w:spacing w:line="340" w:lineRule="exact" w:before="0" w:after="140"/>
               <w:ind w:left="0" w:right="0" w:firstLine="0"/>
               <w:jc w:val="right"/>
             </w:pPr>
@@ -2384,28 +2676,12 @@
         </w:tc>
       </w:tr>
       <w:tr>
-        <w:tblPrEx>
-          <w:tblBorders>
-            <w:top w:val="none" w:color="auto" w:sz="0" w:space="0"/>
-            <w:left w:val="none" w:color="auto" w:sz="0" w:space="0"/>
-            <w:bottom w:val="none" w:color="auto" w:sz="0" w:space="0"/>
-            <w:right w:val="none" w:color="auto" w:sz="0" w:space="0"/>
-            <w:insideH w:val="none" w:color="auto" w:sz="0" w:space="0"/>
-            <w:insideV w:val="none" w:color="auto" w:sz="0" w:space="0"/>
-          </w:tblBorders>
-          <w:tblCellMar>
-            <w:top w:w="0" w:type="dxa"/>
-            <w:left w:w="108" w:type="dxa"/>
-            <w:bottom w:w="0" w:type="dxa"/>
-            <w:right w:w="108" w:type="dxa"/>
-          </w:tblCellMar>
-        </w:tblPrEx>
         <w:trPr>
           <w:cantSplit/>
         </w:trPr>
         <w:tc>
           <w:tcPr>
-            <w:tcW w:w="8674" w:type="dxa"/>
+            <w:tcW w:type="dxa" w:w="8674"/>
             <w:tcMar>
               <w:top w:w="0" w:type="dxa"/>
               <w:left w:w="0" w:type="dxa"/>
@@ -2416,7 +2692,7 @@
           <w:p>
             <w:pPr>
               <w:keepNext w:val="0"/>
-              <w:spacing w:before="0" w:after="140" w:line="340" w:lineRule="exact"/>
+              <w:spacing w:line="340" w:lineRule="exact" w:before="0" w:after="140"/>
               <w:ind w:left="255" w:right="0" w:firstLine="0"/>
               <w:jc w:val="left"/>
             </w:pPr>
@@ -2433,7 +2709,7 @@
         </w:tc>
         <w:tc>
           <w:tcPr>
-            <w:tcW w:w="397" w:type="dxa"/>
+            <w:tcW w:type="dxa" w:w="397"/>
             <w:tcMar>
               <w:top w:w="0" w:type="dxa"/>
               <w:left w:w="0" w:type="dxa"/>
@@ -2444,7 +2720,7 @@
           <w:p>
             <w:pPr>
               <w:keepNext w:val="0"/>
-              <w:spacing w:before="0" w:after="140" w:line="340" w:lineRule="exact"/>
+              <w:spacing w:line="340" w:lineRule="exact" w:before="0" w:after="140"/>
               <w:ind w:left="0" w:right="0" w:firstLine="0"/>
               <w:jc w:val="right"/>
             </w:pPr>
@@ -2461,28 +2737,12 @@
         </w:tc>
       </w:tr>
       <w:tr>
-        <w:tblPrEx>
-          <w:tblBorders>
-            <w:top w:val="none" w:color="auto" w:sz="0" w:space="0"/>
-            <w:left w:val="none" w:color="auto" w:sz="0" w:space="0"/>
-            <w:bottom w:val="none" w:color="auto" w:sz="0" w:space="0"/>
-            <w:right w:val="none" w:color="auto" w:sz="0" w:space="0"/>
-            <w:insideH w:val="none" w:color="auto" w:sz="0" w:space="0"/>
-            <w:insideV w:val="none" w:color="auto" w:sz="0" w:space="0"/>
-          </w:tblBorders>
-          <w:tblCellMar>
-            <w:top w:w="0" w:type="dxa"/>
-            <w:left w:w="108" w:type="dxa"/>
-            <w:bottom w:w="0" w:type="dxa"/>
-            <w:right w:w="108" w:type="dxa"/>
-          </w:tblCellMar>
-        </w:tblPrEx>
         <w:trPr>
           <w:cantSplit/>
         </w:trPr>
         <w:tc>
           <w:tcPr>
-            <w:tcW w:w="8674" w:type="dxa"/>
+            <w:tcW w:type="dxa" w:w="8674"/>
             <w:tcMar>
               <w:top w:w="0" w:type="dxa"/>
               <w:left w:w="0" w:type="dxa"/>
@@ -2493,7 +2753,7 @@
           <w:p>
             <w:pPr>
               <w:keepNext w:val="0"/>
-              <w:spacing w:before="0" w:after="140" w:line="340" w:lineRule="exact"/>
+              <w:spacing w:line="340" w:lineRule="exact" w:before="0" w:after="140"/>
               <w:ind w:left="255" w:right="0" w:firstLine="0"/>
               <w:jc w:val="left"/>
             </w:pPr>
@@ -2510,7 +2770,7 @@
         </w:tc>
         <w:tc>
           <w:tcPr>
-            <w:tcW w:w="397" w:type="dxa"/>
+            <w:tcW w:type="dxa" w:w="397"/>
             <w:tcMar>
               <w:top w:w="0" w:type="dxa"/>
               <w:left w:w="0" w:type="dxa"/>
@@ -2521,7 +2781,7 @@
           <w:p>
             <w:pPr>
               <w:keepNext w:val="0"/>
-              <w:spacing w:before="0" w:after="140" w:line="340" w:lineRule="exact"/>
+              <w:spacing w:line="340" w:lineRule="exact" w:before="0" w:after="140"/>
               <w:ind w:left="0" w:right="0" w:firstLine="0"/>
               <w:jc w:val="right"/>
             </w:pPr>
@@ -2538,28 +2798,12 @@
         </w:tc>
       </w:tr>
       <w:tr>
-        <w:tblPrEx>
-          <w:tblBorders>
-            <w:top w:val="none" w:color="auto" w:sz="0" w:space="0"/>
-            <w:left w:val="none" w:color="auto" w:sz="0" w:space="0"/>
-            <w:bottom w:val="none" w:color="auto" w:sz="0" w:space="0"/>
-            <w:right w:val="none" w:color="auto" w:sz="0" w:space="0"/>
-            <w:insideH w:val="none" w:color="auto" w:sz="0" w:space="0"/>
-            <w:insideV w:val="none" w:color="auto" w:sz="0" w:space="0"/>
-          </w:tblBorders>
-          <w:tblCellMar>
-            <w:top w:w="0" w:type="dxa"/>
-            <w:left w:w="108" w:type="dxa"/>
-            <w:bottom w:w="0" w:type="dxa"/>
-            <w:right w:w="108" w:type="dxa"/>
-          </w:tblCellMar>
-        </w:tblPrEx>
         <w:trPr>
           <w:cantSplit/>
         </w:trPr>
         <w:tc>
           <w:tcPr>
-            <w:tcW w:w="8674" w:type="dxa"/>
+            <w:tcW w:type="dxa" w:w="8674"/>
             <w:tcMar>
               <w:top w:w="0" w:type="dxa"/>
               <w:left w:w="0" w:type="dxa"/>
@@ -2570,7 +2814,7 @@
           <w:p>
             <w:pPr>
               <w:keepNext w:val="0"/>
-              <w:spacing w:before="0" w:after="140" w:line="340" w:lineRule="exact"/>
+              <w:spacing w:line="340" w:lineRule="exact" w:before="0" w:after="140"/>
               <w:ind w:left="0" w:right="0" w:firstLine="0"/>
               <w:jc w:val="left"/>
             </w:pPr>
@@ -2587,7 +2831,7 @@
         </w:tc>
         <w:tc>
           <w:tcPr>
-            <w:tcW w:w="397" w:type="dxa"/>
+            <w:tcW w:type="dxa" w:w="397"/>
             <w:tcMar>
               <w:top w:w="0" w:type="dxa"/>
               <w:left w:w="0" w:type="dxa"/>
@@ -2598,7 +2842,7 @@
           <w:p>
             <w:pPr>
               <w:keepNext w:val="0"/>
-              <w:spacing w:before="0" w:after="140" w:line="340" w:lineRule="exact"/>
+              <w:spacing w:line="340" w:lineRule="exact" w:before="0" w:after="140"/>
               <w:ind w:left="0" w:right="0" w:firstLine="0"/>
               <w:jc w:val="right"/>
             </w:pPr>
@@ -2615,28 +2859,12 @@
         </w:tc>
       </w:tr>
       <w:tr>
-        <w:tblPrEx>
-          <w:tblBorders>
-            <w:top w:val="none" w:color="auto" w:sz="0" w:space="0"/>
-            <w:left w:val="none" w:color="auto" w:sz="0" w:space="0"/>
-            <w:bottom w:val="none" w:color="auto" w:sz="0" w:space="0"/>
-            <w:right w:val="none" w:color="auto" w:sz="0" w:space="0"/>
-            <w:insideH w:val="none" w:color="auto" w:sz="0" w:space="0"/>
-            <w:insideV w:val="none" w:color="auto" w:sz="0" w:space="0"/>
-          </w:tblBorders>
-          <w:tblCellMar>
-            <w:top w:w="0" w:type="dxa"/>
-            <w:left w:w="108" w:type="dxa"/>
-            <w:bottom w:w="0" w:type="dxa"/>
-            <w:right w:w="108" w:type="dxa"/>
-          </w:tblCellMar>
-        </w:tblPrEx>
         <w:trPr>
           <w:cantSplit/>
         </w:trPr>
         <w:tc>
           <w:tcPr>
-            <w:tcW w:w="8674" w:type="dxa"/>
+            <w:tcW w:type="dxa" w:w="8674"/>
             <w:tcMar>
               <w:top w:w="0" w:type="dxa"/>
               <w:left w:w="0" w:type="dxa"/>
@@ -2647,7 +2875,7 @@
           <w:p>
             <w:pPr>
               <w:keepNext w:val="0"/>
-              <w:spacing w:before="0" w:after="140" w:line="340" w:lineRule="exact"/>
+              <w:spacing w:line="340" w:lineRule="exact" w:before="0" w:after="140"/>
               <w:ind w:left="0" w:right="0" w:firstLine="0"/>
               <w:jc w:val="left"/>
             </w:pPr>
@@ -2664,7 +2892,7 @@
         </w:tc>
         <w:tc>
           <w:tcPr>
-            <w:tcW w:w="397" w:type="dxa"/>
+            <w:tcW w:type="dxa" w:w="397"/>
             <w:tcMar>
               <w:top w:w="0" w:type="dxa"/>
               <w:left w:w="0" w:type="dxa"/>
@@ -2675,7 +2903,7 @@
           <w:p>
             <w:pPr>
               <w:keepNext w:val="0"/>
-              <w:spacing w:before="0" w:after="140" w:line="340" w:lineRule="exact"/>
+              <w:spacing w:line="340" w:lineRule="exact" w:before="0" w:after="140"/>
               <w:ind w:left="0" w:right="0" w:firstLine="0"/>
               <w:jc w:val="right"/>
             </w:pPr>
@@ -2693,12 +2921,17 @@
       </w:tr>
     </w:tbl>
     <w:p>
-      <w:r>
-        <w:rPr>
-          <w:color w:val="000000"/>
-        </w:rPr>
-        <w:br w:type="page"/>
-      </w:r>
+      <w:pPr>
+        <w:sectPr>
+          <w:footerReference w:type="default" r:id="rId30"/>
+          <w:type w:val="nextPage"/>
+          <w:pgSz w:w="11906" w:h="16838"/>
+          <w:pgMar w:top="1247" w:right="1134" w:bottom="1134" w:left="1701" w:header="720" w:footer="567" w:gutter="0"/>
+          <w:cols w:space="720" w:num="1"/>
+          <w:docGrid w:linePitch="360" w:charSpace="0"/>
+          <w:pgNumType w:start="2"/>
+        </w:sectPr>
+      </w:pPr>
     </w:p>
     <w:p>
       <w:pPr>
@@ -2794,12 +3027,17 @@
       </w:r>
     </w:p>
     <w:p>
-      <w:r>
-        <w:rPr>
-          <w:color w:val="000000"/>
-        </w:rPr>
-        <w:br w:type="page"/>
-      </w:r>
+      <w:pPr>
+        <w:sectPr>
+          <w:footerReference w:type="default" r:id="rId31"/>
+          <w:type w:val="nextPage"/>
+          <w:pgSz w:w="11906" w:h="16838"/>
+          <w:pgMar w:top="1247" w:right="1134" w:bottom="1134" w:left="1701" w:header="720" w:footer="567" w:gutter="0"/>
+          <w:cols w:space="720" w:num="1"/>
+          <w:docGrid w:linePitch="360" w:charSpace="0"/>
+          <w:pgNumType w:start="3"/>
+        </w:sectPr>
+      </w:pPr>
     </w:p>
     <w:p>
       <w:pPr>
@@ -3327,12 +3565,17 @@
       </w:r>
     </w:p>
     <w:p>
-      <w:r>
-        <w:rPr>
-          <w:color w:val="000000"/>
-        </w:rPr>
-        <w:br w:type="page"/>
-      </w:r>
+      <w:pPr>
+        <w:sectPr>
+          <w:footerReference w:type="default" r:id="rId32"/>
+          <w:type w:val="nextPage"/>
+          <w:pgSz w:w="11906" w:h="16838"/>
+          <w:pgMar w:top="1247" w:right="1134" w:bottom="1134" w:left="1701" w:header="720" w:footer="567" w:gutter="0"/>
+          <w:cols w:space="720" w:num="1"/>
+          <w:docGrid w:linePitch="360" w:charSpace="0"/>
+          <w:pgNumType w:start="4"/>
+        </w:sectPr>
+      </w:pPr>
     </w:p>
     <w:p>
       <w:pPr>
@@ -3450,12 +3693,17 @@
       </w:r>
     </w:p>
     <w:p>
-      <w:r>
-        <w:rPr>
-          <w:color w:val="000000"/>
-        </w:rPr>
-        <w:br w:type="page"/>
-      </w:r>
+      <w:pPr>
+        <w:sectPr>
+          <w:footerReference w:type="default" r:id="rId33"/>
+          <w:type w:val="nextPage"/>
+          <w:pgSz w:w="11906" w:h="16838"/>
+          <w:pgMar w:top="1247" w:right="1134" w:bottom="1134" w:left="1701" w:header="720" w:footer="567" w:gutter="0"/>
+          <w:cols w:space="720" w:num="1"/>
+          <w:docGrid w:linePitch="360" w:charSpace="0"/>
+          <w:pgNumType w:start="5"/>
+        </w:sectPr>
+      </w:pPr>
     </w:p>
     <w:p>
       <w:pPr>
@@ -3626,12 +3874,17 @@
       </w:r>
     </w:p>
     <w:p>
-      <w:r>
-        <w:rPr>
-          <w:color w:val="000000"/>
-        </w:rPr>
-        <w:br w:type="page"/>
-      </w:r>
+      <w:pPr>
+        <w:sectPr>
+          <w:footerReference w:type="default" r:id="rId34"/>
+          <w:type w:val="nextPage"/>
+          <w:pgSz w:w="11906" w:h="16838"/>
+          <w:pgMar w:top="1247" w:right="1134" w:bottom="1134" w:left="1701" w:header="720" w:footer="567" w:gutter="0"/>
+          <w:cols w:space="720" w:num="1"/>
+          <w:docGrid w:linePitch="360" w:charSpace="0"/>
+          <w:pgNumType w:start="6"/>
+        </w:sectPr>
+      </w:pPr>
     </w:p>
     <w:p>
       <w:pPr>
@@ -4132,12 +4385,17 @@
       </w:r>
     </w:p>
     <w:p>
-      <w:r>
-        <w:rPr>
-          <w:color w:val="000000"/>
-        </w:rPr>
-        <w:br w:type="page"/>
-      </w:r>
+      <w:pPr>
+        <w:sectPr>
+          <w:footerReference w:type="default" r:id="rId35"/>
+          <w:type w:val="nextPage"/>
+          <w:pgSz w:w="11906" w:h="16838"/>
+          <w:pgMar w:top="1247" w:right="1134" w:bottom="1134" w:left="1701" w:header="720" w:footer="567" w:gutter="0"/>
+          <w:cols w:space="720" w:num="1"/>
+          <w:docGrid w:linePitch="360" w:charSpace="0"/>
+          <w:pgNumType w:start="7"/>
+        </w:sectPr>
+      </w:pPr>
     </w:p>
     <w:p>
       <w:pPr>
@@ -4310,12 +4568,17 @@
       </w:r>
     </w:p>
     <w:p>
-      <w:r>
-        <w:rPr>
-          <w:color w:val="000000"/>
-        </w:rPr>
-        <w:br w:type="page"/>
-      </w:r>
+      <w:pPr>
+        <w:sectPr>
+          <w:footerReference w:type="default" r:id="rId36"/>
+          <w:type w:val="nextPage"/>
+          <w:pgSz w:w="11906" w:h="16838"/>
+          <w:pgMar w:top="1247" w:right="1134" w:bottom="1134" w:left="1701" w:header="720" w:footer="567" w:gutter="0"/>
+          <w:cols w:space="720" w:num="1"/>
+          <w:docGrid w:linePitch="360" w:charSpace="0"/>
+          <w:pgNumType w:start="8"/>
+        </w:sectPr>
+      </w:pPr>
     </w:p>
     <w:p>
       <w:pPr>
@@ -4447,12 +4710,17 @@
       </w:r>
     </w:p>
     <w:p>
-      <w:r>
-        <w:rPr>
-          <w:color w:val="000000"/>
-        </w:rPr>
-        <w:br w:type="page"/>
-      </w:r>
+      <w:pPr>
+        <w:sectPr>
+          <w:footerReference w:type="default" r:id="rId37"/>
+          <w:type w:val="nextPage"/>
+          <w:pgSz w:w="11906" w:h="16838"/>
+          <w:pgMar w:top="1247" w:right="1134" w:bottom="1134" w:left="1701" w:header="720" w:footer="567" w:gutter="0"/>
+          <w:cols w:space="720" w:num="1"/>
+          <w:docGrid w:linePitch="360" w:charSpace="0"/>
+          <w:pgNumType w:start="9"/>
+        </w:sectPr>
+      </w:pPr>
     </w:p>
     <w:p>
       <w:pPr>
@@ -6103,12 +6371,17 @@
       </w:r>
     </w:p>
     <w:p>
-      <w:r>
-        <w:rPr>
-          <w:color w:val="000000"/>
-        </w:rPr>
-        <w:br w:type="page"/>
-      </w:r>
+      <w:pPr>
+        <w:sectPr>
+          <w:footerReference w:type="default" r:id="rId38"/>
+          <w:type w:val="nextPage"/>
+          <w:pgSz w:w="11906" w:h="16838"/>
+          <w:pgMar w:top="1247" w:right="1134" w:bottom="1134" w:left="1701" w:header="720" w:footer="567" w:gutter="0"/>
+          <w:cols w:space="720" w:num="1"/>
+          <w:docGrid w:linePitch="360" w:charSpace="0"/>
+          <w:pgNumType w:start="10"/>
+        </w:sectPr>
+      </w:pPr>
     </w:p>
     <w:p>
       <w:pPr>
@@ -6279,12 +6552,17 @@
       </w:r>
     </w:p>
     <w:p>
-      <w:r>
-        <w:rPr>
-          <w:color w:val="000000"/>
-        </w:rPr>
-        <w:br w:type="page"/>
-      </w:r>
+      <w:pPr>
+        <w:sectPr>
+          <w:footerReference w:type="default" r:id="rId39"/>
+          <w:type w:val="nextPage"/>
+          <w:pgSz w:w="11906" w:h="16838"/>
+          <w:pgMar w:top="1247" w:right="1134" w:bottom="1134" w:left="1701" w:header="720" w:footer="567" w:gutter="0"/>
+          <w:cols w:space="720" w:num="1"/>
+          <w:docGrid w:linePitch="360" w:charSpace="0"/>
+          <w:pgNumType w:start="11"/>
+        </w:sectPr>
+      </w:pPr>
     </w:p>
     <w:p>
       <w:pPr>
@@ -6767,12 +7045,17 @@
       </w:r>
     </w:p>
     <w:p>
-      <w:r>
-        <w:rPr>
-          <w:color w:val="000000"/>
-        </w:rPr>
-        <w:br w:type="page"/>
-      </w:r>
+      <w:pPr>
+        <w:sectPr>
+          <w:footerReference w:type="default" r:id="rId40"/>
+          <w:type w:val="nextPage"/>
+          <w:pgSz w:w="11906" w:h="16838"/>
+          <w:pgMar w:top="1247" w:right="1134" w:bottom="1134" w:left="1701" w:header="720" w:footer="567" w:gutter="0"/>
+          <w:cols w:space="720" w:num="1"/>
+          <w:docGrid w:linePitch="360" w:charSpace="0"/>
+          <w:pgNumType w:start="12"/>
+        </w:sectPr>
+      </w:pPr>
     </w:p>
     <w:p>
       <w:pPr>
@@ -6890,12 +7173,17 @@
       </w:r>
     </w:p>
     <w:p>
-      <w:r>
-        <w:rPr>
-          <w:color w:val="000000"/>
-        </w:rPr>
-        <w:br w:type="page"/>
-      </w:r>
+      <w:pPr>
+        <w:sectPr>
+          <w:footerReference w:type="default" r:id="rId41"/>
+          <w:type w:val="nextPage"/>
+          <w:pgSz w:w="11906" w:h="16838"/>
+          <w:pgMar w:top="1247" w:right="1134" w:bottom="1134" w:left="1701" w:header="720" w:footer="567" w:gutter="0"/>
+          <w:cols w:space="720" w:num="1"/>
+          <w:docGrid w:linePitch="360" w:charSpace="0"/>
+          <w:pgNumType w:start="13"/>
+        </w:sectPr>
+      </w:pPr>
     </w:p>
     <w:p>
       <w:pPr>
@@ -7506,12 +7794,17 @@
       </w:r>
     </w:p>
     <w:p>
-      <w:r>
-        <w:rPr>
-          <w:color w:val="000000"/>
-        </w:rPr>
-        <w:br w:type="page"/>
-      </w:r>
+      <w:pPr>
+        <w:sectPr>
+          <w:footerReference w:type="default" r:id="rId42"/>
+          <w:type w:val="nextPage"/>
+          <w:pgSz w:w="11906" w:h="16838"/>
+          <w:pgMar w:top="1247" w:right="1134" w:bottom="1134" w:left="1701" w:header="720" w:footer="567" w:gutter="0"/>
+          <w:cols w:space="720" w:num="1"/>
+          <w:docGrid w:linePitch="360" w:charSpace="0"/>
+          <w:pgNumType w:start="14"/>
+        </w:sectPr>
+      </w:pPr>
     </w:p>
     <w:p>
       <w:pPr>
@@ -7607,12 +7900,17 @@
       </w:r>
     </w:p>
     <w:p>
-      <w:r>
-        <w:rPr>
-          <w:color w:val="000000"/>
-        </w:rPr>
-        <w:br w:type="page"/>
-      </w:r>
+      <w:pPr>
+        <w:sectPr>
+          <w:footerReference w:type="default" r:id="rId43"/>
+          <w:type w:val="nextPage"/>
+          <w:pgSz w:w="11906" w:h="16838"/>
+          <w:pgMar w:top="1247" w:right="1134" w:bottom="1134" w:left="1701" w:header="720" w:footer="567" w:gutter="0"/>
+          <w:cols w:space="720" w:num="1"/>
+          <w:docGrid w:linePitch="360" w:charSpace="0"/>
+          <w:pgNumType w:start="15"/>
+        </w:sectPr>
+      </w:pPr>
     </w:p>
     <w:p>
       <w:pPr>
@@ -7854,6 +8152,7 @@
       <w:pgMar w:top="1247" w:right="1134" w:bottom="1134" w:left="1701" w:header="720" w:footer="567" w:gutter="0"/>
       <w:cols w:space="720" w:num="1"/>
       <w:docGrid w:linePitch="360" w:charSpace="0"/>
+      <w:pgNumType w:start="16"/>
     </w:sectPr>
   </w:body>
 </w:document>
@@ -7888,28 +8187,206 @@
 <w:ftr xmlns:wpc="http://schemas.microsoft.com/office/word/2010/wordprocessingCanvas" xmlns:mc="http://schemas.openxmlformats.org/markup-compatibility/2006" xmlns:o="urn:schemas-microsoft-com:office:office" xmlns:r="http://schemas.openxmlformats.org/officeDocument/2006/relationships" xmlns:m="http://schemas.openxmlformats.org/officeDocument/2006/math" xmlns:v="urn:schemas-microsoft-com:vml" xmlns:wp14="http://schemas.microsoft.com/office/word/2010/wordprocessingDrawing" xmlns:wp="http://schemas.openxmlformats.org/drawingml/2006/wordprocessingDrawing" xmlns:w10="urn:schemas-microsoft-com:office:word" xmlns:w="http://schemas.openxmlformats.org/wordprocessingml/2006/main" xmlns:w14="http://schemas.microsoft.com/office/word/2010/wordml" xmlns:w15="http://schemas.microsoft.com/office/word/2012/wordml" xmlns:wpg="http://schemas.microsoft.com/office/word/2010/wordprocessingGroup" xmlns:wpi="http://schemas.microsoft.com/office/word/2010/wordprocessingInk" xmlns:wne="http://schemas.microsoft.com/office/word/2006/wordml" xmlns:wps="http://schemas.microsoft.com/office/word/2010/wordprocessingShape" xmlns:wpsCustomData="http://www.wps.cn/officeDocument/2013/wpsCustomData" mc:Ignorable="w14 w15 wp14">
   <w:p>
     <w:pPr>
-      <w:spacing w:before="0" w:after="0"/>
+      <w:spacing w:before="0" w:after="0" w:line="240" w:lineRule="auto"/>
       <w:jc w:val="center"/>
     </w:pPr>
     <w:r>
-      <w:fldChar w:fldCharType="begin"/>
-    </w:r>
-    <w:r>
-      <w:instrText xml:space="preserve">PAGE</w:instrText>
-    </w:r>
-    <w:r>
-      <w:fldChar w:fldCharType="separate"/>
-    </w:r>
-    <w:r>
-      <w:t>1</w:t>
-    </w:r>
-    <w:r>
-      <w:rPr>
-        <w:rFonts w:ascii="Times New Roman" w:hAnsi="Times New Roman" w:eastAsia="Times New Roman"/>
+      <w:rPr>
+        <w:rFonts w:ascii="Times New Roman" w:hAnsi="Times New Roman"/>
         <w:color w:val="000000"/>
         <w:sz w:val="26"/>
       </w:rPr>
-      <w:fldChar w:fldCharType="end"/>
+      <w:t>16</w:t>
+    </w:r>
+  </w:p>
+</w:ftr>
+</file>
+
+<file path=word/footer10.xml><?xml version="1.0" encoding="utf-8"?>
+<w:ftr xmlns:m="http://schemas.openxmlformats.org/officeDocument/2006/math" xmlns:mc="http://schemas.openxmlformats.org/markup-compatibility/2006" xmlns:mo="http://schemas.microsoft.com/office/mac/office/2008/main" xmlns:mv="urn:schemas-microsoft-com:mac:vml" xmlns:o="urn:schemas-microsoft-com:office:office" xmlns:r="http://schemas.openxmlformats.org/officeDocument/2006/relationships" xmlns:v="urn:schemas-microsoft-com:vml" xmlns:w10="urn:schemas-microsoft-com:office:word" xmlns:w14="http://schemas.microsoft.com/office/word/2010/wordml" xmlns:w="http://schemas.openxmlformats.org/wordprocessingml/2006/main" xmlns:wne="http://schemas.microsoft.com/office/word/2006/wordml" xmlns:wp14="http://schemas.microsoft.com/office/word/2010/wordprocessingDrawing" xmlns:wp="http://schemas.openxmlformats.org/drawingml/2006/wordprocessingDrawing" xmlns:wpc="http://schemas.microsoft.com/office/word/2010/wordprocessingCanvas" xmlns:wpg="http://schemas.microsoft.com/office/word/2010/wordprocessingGroup" xmlns:wpi="http://schemas.microsoft.com/office/word/2010/wordprocessingInk" xmlns:wps="http://schemas.microsoft.com/office/word/2010/wordprocessingShape" mc:Ignorable="w14 wp14">
+  <w:p>
+    <w:pPr>
+      <w:spacing w:before="0" w:after="0" w:line="240" w:lineRule="auto"/>
+      <w:jc w:val="center"/>
+    </w:pPr>
+    <w:r>
+      <w:rPr>
+        <w:rFonts w:ascii="Times New Roman" w:hAnsi="Times New Roman"/>
+        <w:color w:val="000000"/>
+        <w:sz w:val="26"/>
+      </w:rPr>
+      <w:t>7</w:t>
+    </w:r>
+  </w:p>
+</w:ftr>
+</file>
+
+<file path=word/footer11.xml><?xml version="1.0" encoding="utf-8"?>
+<w:ftr xmlns:m="http://schemas.openxmlformats.org/officeDocument/2006/math" xmlns:mc="http://schemas.openxmlformats.org/markup-compatibility/2006" xmlns:mo="http://schemas.microsoft.com/office/mac/office/2008/main" xmlns:mv="urn:schemas-microsoft-com:mac:vml" xmlns:o="urn:schemas-microsoft-com:office:office" xmlns:r="http://schemas.openxmlformats.org/officeDocument/2006/relationships" xmlns:v="urn:schemas-microsoft-com:vml" xmlns:w10="urn:schemas-microsoft-com:office:word" xmlns:w14="http://schemas.microsoft.com/office/word/2010/wordml" xmlns:w="http://schemas.openxmlformats.org/wordprocessingml/2006/main" xmlns:wne="http://schemas.microsoft.com/office/word/2006/wordml" xmlns:wp14="http://schemas.microsoft.com/office/word/2010/wordprocessingDrawing" xmlns:wp="http://schemas.openxmlformats.org/drawingml/2006/wordprocessingDrawing" xmlns:wpc="http://schemas.microsoft.com/office/word/2010/wordprocessingCanvas" xmlns:wpg="http://schemas.microsoft.com/office/word/2010/wordprocessingGroup" xmlns:wpi="http://schemas.microsoft.com/office/word/2010/wordprocessingInk" xmlns:wps="http://schemas.microsoft.com/office/word/2010/wordprocessingShape" mc:Ignorable="w14 wp14">
+  <w:p>
+    <w:pPr>
+      <w:spacing w:before="0" w:after="0" w:line="240" w:lineRule="auto"/>
+      <w:jc w:val="center"/>
+    </w:pPr>
+    <w:r>
+      <w:rPr>
+        <w:rFonts w:ascii="Times New Roman" w:hAnsi="Times New Roman"/>
+        <w:color w:val="000000"/>
+        <w:sz w:val="26"/>
+      </w:rPr>
+      <w:t>8</w:t>
+    </w:r>
+  </w:p>
+</w:ftr>
+</file>
+
+<file path=word/footer12.xml><?xml version="1.0" encoding="utf-8"?>
+<w:ftr xmlns:m="http://schemas.openxmlformats.org/officeDocument/2006/math" xmlns:mc="http://schemas.openxmlformats.org/markup-compatibility/2006" xmlns:mo="http://schemas.microsoft.com/office/mac/office/2008/main" xmlns:mv="urn:schemas-microsoft-com:mac:vml" xmlns:o="urn:schemas-microsoft-com:office:office" xmlns:r="http://schemas.openxmlformats.org/officeDocument/2006/relationships" xmlns:v="urn:schemas-microsoft-com:vml" xmlns:w10="urn:schemas-microsoft-com:office:word" xmlns:w14="http://schemas.microsoft.com/office/word/2010/wordml" xmlns:w="http://schemas.openxmlformats.org/wordprocessingml/2006/main" xmlns:wne="http://schemas.microsoft.com/office/word/2006/wordml" xmlns:wp14="http://schemas.microsoft.com/office/word/2010/wordprocessingDrawing" xmlns:wp="http://schemas.openxmlformats.org/drawingml/2006/wordprocessingDrawing" xmlns:wpc="http://schemas.microsoft.com/office/word/2010/wordprocessingCanvas" xmlns:wpg="http://schemas.microsoft.com/office/word/2010/wordprocessingGroup" xmlns:wpi="http://schemas.microsoft.com/office/word/2010/wordprocessingInk" xmlns:wps="http://schemas.microsoft.com/office/word/2010/wordprocessingShape" mc:Ignorable="w14 wp14">
+  <w:p>
+    <w:pPr>
+      <w:spacing w:before="0" w:after="0" w:line="240" w:lineRule="auto"/>
+      <w:jc w:val="center"/>
+    </w:pPr>
+    <w:r>
+      <w:rPr>
+        <w:rFonts w:ascii="Times New Roman" w:hAnsi="Times New Roman"/>
+        <w:color w:val="000000"/>
+        <w:sz w:val="26"/>
+      </w:rPr>
+      <w:t>9</w:t>
+    </w:r>
+  </w:p>
+</w:ftr>
+</file>
+
+<file path=word/footer13.xml><?xml version="1.0" encoding="utf-8"?>
+<w:ftr xmlns:m="http://schemas.openxmlformats.org/officeDocument/2006/math" xmlns:mc="http://schemas.openxmlformats.org/markup-compatibility/2006" xmlns:mo="http://schemas.microsoft.com/office/mac/office/2008/main" xmlns:mv="urn:schemas-microsoft-com:mac:vml" xmlns:o="urn:schemas-microsoft-com:office:office" xmlns:r="http://schemas.openxmlformats.org/officeDocument/2006/relationships" xmlns:v="urn:schemas-microsoft-com:vml" xmlns:w10="urn:schemas-microsoft-com:office:word" xmlns:w14="http://schemas.microsoft.com/office/word/2010/wordml" xmlns:w="http://schemas.openxmlformats.org/wordprocessingml/2006/main" xmlns:wne="http://schemas.microsoft.com/office/word/2006/wordml" xmlns:wp14="http://schemas.microsoft.com/office/word/2010/wordprocessingDrawing" xmlns:wp="http://schemas.openxmlformats.org/drawingml/2006/wordprocessingDrawing" xmlns:wpc="http://schemas.microsoft.com/office/word/2010/wordprocessingCanvas" xmlns:wpg="http://schemas.microsoft.com/office/word/2010/wordprocessingGroup" xmlns:wpi="http://schemas.microsoft.com/office/word/2010/wordprocessingInk" xmlns:wps="http://schemas.microsoft.com/office/word/2010/wordprocessingShape" mc:Ignorable="w14 wp14">
+  <w:p>
+    <w:pPr>
+      <w:spacing w:before="0" w:after="0" w:line="240" w:lineRule="auto"/>
+      <w:jc w:val="center"/>
+    </w:pPr>
+    <w:r>
+      <w:rPr>
+        <w:rFonts w:ascii="Times New Roman" w:hAnsi="Times New Roman"/>
+        <w:color w:val="000000"/>
+        <w:sz w:val="26"/>
+      </w:rPr>
+      <w:t>10</w:t>
+    </w:r>
+  </w:p>
+</w:ftr>
+</file>
+
+<file path=word/footer14.xml><?xml version="1.0" encoding="utf-8"?>
+<w:ftr xmlns:m="http://schemas.openxmlformats.org/officeDocument/2006/math" xmlns:mc="http://schemas.openxmlformats.org/markup-compatibility/2006" xmlns:mo="http://schemas.microsoft.com/office/mac/office/2008/main" xmlns:mv="urn:schemas-microsoft-com:mac:vml" xmlns:o="urn:schemas-microsoft-com:office:office" xmlns:r="http://schemas.openxmlformats.org/officeDocument/2006/relationships" xmlns:v="urn:schemas-microsoft-com:vml" xmlns:w10="urn:schemas-microsoft-com:office:word" xmlns:w14="http://schemas.microsoft.com/office/word/2010/wordml" xmlns:w="http://schemas.openxmlformats.org/wordprocessingml/2006/main" xmlns:wne="http://schemas.microsoft.com/office/word/2006/wordml" xmlns:wp14="http://schemas.microsoft.com/office/word/2010/wordprocessingDrawing" xmlns:wp="http://schemas.openxmlformats.org/drawingml/2006/wordprocessingDrawing" xmlns:wpc="http://schemas.microsoft.com/office/word/2010/wordprocessingCanvas" xmlns:wpg="http://schemas.microsoft.com/office/word/2010/wordprocessingGroup" xmlns:wpi="http://schemas.microsoft.com/office/word/2010/wordprocessingInk" xmlns:wps="http://schemas.microsoft.com/office/word/2010/wordprocessingShape" mc:Ignorable="w14 wp14">
+  <w:p>
+    <w:pPr>
+      <w:spacing w:before="0" w:after="0" w:line="240" w:lineRule="auto"/>
+      <w:jc w:val="center"/>
+    </w:pPr>
+    <w:r>
+      <w:rPr>
+        <w:rFonts w:ascii="Times New Roman" w:hAnsi="Times New Roman"/>
+        <w:color w:val="000000"/>
+        <w:sz w:val="26"/>
+      </w:rPr>
+      <w:t>11</w:t>
+    </w:r>
+  </w:p>
+</w:ftr>
+</file>
+
+<file path=word/footer15.xml><?xml version="1.0" encoding="utf-8"?>
+<w:ftr xmlns:m="http://schemas.openxmlformats.org/officeDocument/2006/math" xmlns:mc="http://schemas.openxmlformats.org/markup-compatibility/2006" xmlns:mo="http://schemas.microsoft.com/office/mac/office/2008/main" xmlns:mv="urn:schemas-microsoft-com:mac:vml" xmlns:o="urn:schemas-microsoft-com:office:office" xmlns:r="http://schemas.openxmlformats.org/officeDocument/2006/relationships" xmlns:v="urn:schemas-microsoft-com:vml" xmlns:w10="urn:schemas-microsoft-com:office:word" xmlns:w14="http://schemas.microsoft.com/office/word/2010/wordml" xmlns:w="http://schemas.openxmlformats.org/wordprocessingml/2006/main" xmlns:wne="http://schemas.microsoft.com/office/word/2006/wordml" xmlns:wp14="http://schemas.microsoft.com/office/word/2010/wordprocessingDrawing" xmlns:wp="http://schemas.openxmlformats.org/drawingml/2006/wordprocessingDrawing" xmlns:wpc="http://schemas.microsoft.com/office/word/2010/wordprocessingCanvas" xmlns:wpg="http://schemas.microsoft.com/office/word/2010/wordprocessingGroup" xmlns:wpi="http://schemas.microsoft.com/office/word/2010/wordprocessingInk" xmlns:wps="http://schemas.microsoft.com/office/word/2010/wordprocessingShape" mc:Ignorable="w14 wp14">
+  <w:p>
+    <w:pPr>
+      <w:spacing w:before="0" w:after="0" w:line="240" w:lineRule="auto"/>
+      <w:jc w:val="center"/>
+    </w:pPr>
+    <w:r>
+      <w:rPr>
+        <w:rFonts w:ascii="Times New Roman" w:hAnsi="Times New Roman"/>
+        <w:color w:val="000000"/>
+        <w:sz w:val="26"/>
+      </w:rPr>
+      <w:t>12</w:t>
+    </w:r>
+  </w:p>
+</w:ftr>
+</file>
+
+<file path=word/footer16.xml><?xml version="1.0" encoding="utf-8"?>
+<w:ftr xmlns:m="http://schemas.openxmlformats.org/officeDocument/2006/math" xmlns:mc="http://schemas.openxmlformats.org/markup-compatibility/2006" xmlns:mo="http://schemas.microsoft.com/office/mac/office/2008/main" xmlns:mv="urn:schemas-microsoft-com:mac:vml" xmlns:o="urn:schemas-microsoft-com:office:office" xmlns:r="http://schemas.openxmlformats.org/officeDocument/2006/relationships" xmlns:v="urn:schemas-microsoft-com:vml" xmlns:w10="urn:schemas-microsoft-com:office:word" xmlns:w14="http://schemas.microsoft.com/office/word/2010/wordml" xmlns:w="http://schemas.openxmlformats.org/wordprocessingml/2006/main" xmlns:wne="http://schemas.microsoft.com/office/word/2006/wordml" xmlns:wp14="http://schemas.microsoft.com/office/word/2010/wordprocessingDrawing" xmlns:wp="http://schemas.openxmlformats.org/drawingml/2006/wordprocessingDrawing" xmlns:wpc="http://schemas.microsoft.com/office/word/2010/wordprocessingCanvas" xmlns:wpg="http://schemas.microsoft.com/office/word/2010/wordprocessingGroup" xmlns:wpi="http://schemas.microsoft.com/office/word/2010/wordprocessingInk" xmlns:wps="http://schemas.microsoft.com/office/word/2010/wordprocessingShape" mc:Ignorable="w14 wp14">
+  <w:p>
+    <w:pPr>
+      <w:spacing w:before="0" w:after="0" w:line="240" w:lineRule="auto"/>
+      <w:jc w:val="center"/>
+    </w:pPr>
+    <w:r>
+      <w:rPr>
+        <w:rFonts w:ascii="Times New Roman" w:hAnsi="Times New Roman"/>
+        <w:color w:val="000000"/>
+        <w:sz w:val="26"/>
+      </w:rPr>
+      <w:t>13</w:t>
+    </w:r>
+  </w:p>
+</w:ftr>
+</file>
+
+<file path=word/footer17.xml><?xml version="1.0" encoding="utf-8"?>
+<w:ftr xmlns:m="http://schemas.openxmlformats.org/officeDocument/2006/math" xmlns:mc="http://schemas.openxmlformats.org/markup-compatibility/2006" xmlns:mo="http://schemas.microsoft.com/office/mac/office/2008/main" xmlns:mv="urn:schemas-microsoft-com:mac:vml" xmlns:o="urn:schemas-microsoft-com:office:office" xmlns:r="http://schemas.openxmlformats.org/officeDocument/2006/relationships" xmlns:v="urn:schemas-microsoft-com:vml" xmlns:w10="urn:schemas-microsoft-com:office:word" xmlns:w14="http://schemas.microsoft.com/office/word/2010/wordml" xmlns:w="http://schemas.openxmlformats.org/wordprocessingml/2006/main" xmlns:wne="http://schemas.microsoft.com/office/word/2006/wordml" xmlns:wp14="http://schemas.microsoft.com/office/word/2010/wordprocessingDrawing" xmlns:wp="http://schemas.openxmlformats.org/drawingml/2006/wordprocessingDrawing" xmlns:wpc="http://schemas.microsoft.com/office/word/2010/wordprocessingCanvas" xmlns:wpg="http://schemas.microsoft.com/office/word/2010/wordprocessingGroup" xmlns:wpi="http://schemas.microsoft.com/office/word/2010/wordprocessingInk" xmlns:wps="http://schemas.microsoft.com/office/word/2010/wordprocessingShape" mc:Ignorable="w14 wp14">
+  <w:p>
+    <w:pPr>
+      <w:spacing w:before="0" w:after="0" w:line="240" w:lineRule="auto"/>
+      <w:jc w:val="center"/>
+    </w:pPr>
+    <w:r>
+      <w:rPr>
+        <w:rFonts w:ascii="Times New Roman" w:hAnsi="Times New Roman"/>
+        <w:color w:val="000000"/>
+        <w:sz w:val="26"/>
+      </w:rPr>
+      <w:t>14</w:t>
+    </w:r>
+  </w:p>
+</w:ftr>
+</file>
+
+<file path=word/footer18.xml><?xml version="1.0" encoding="utf-8"?>
+<w:ftr xmlns:m="http://schemas.openxmlformats.org/officeDocument/2006/math" xmlns:mc="http://schemas.openxmlformats.org/markup-compatibility/2006" xmlns:mo="http://schemas.microsoft.com/office/mac/office/2008/main" xmlns:mv="urn:schemas-microsoft-com:mac:vml" xmlns:o="urn:schemas-microsoft-com:office:office" xmlns:r="http://schemas.openxmlformats.org/officeDocument/2006/relationships" xmlns:v="urn:schemas-microsoft-com:vml" xmlns:w10="urn:schemas-microsoft-com:office:word" xmlns:w14="http://schemas.microsoft.com/office/word/2010/wordml" xmlns:w="http://schemas.openxmlformats.org/wordprocessingml/2006/main" xmlns:wne="http://schemas.microsoft.com/office/word/2006/wordml" xmlns:wp14="http://schemas.microsoft.com/office/word/2010/wordprocessingDrawing" xmlns:wp="http://schemas.openxmlformats.org/drawingml/2006/wordprocessingDrawing" xmlns:wpc="http://schemas.microsoft.com/office/word/2010/wordprocessingCanvas" xmlns:wpg="http://schemas.microsoft.com/office/word/2010/wordprocessingGroup" xmlns:wpi="http://schemas.microsoft.com/office/word/2010/wordprocessingInk" xmlns:wps="http://schemas.microsoft.com/office/word/2010/wordprocessingShape" mc:Ignorable="w14 wp14">
+  <w:p>
+    <w:pPr>
+      <w:spacing w:before="0" w:after="0" w:line="240" w:lineRule="auto"/>
+      <w:jc w:val="center"/>
+    </w:pPr>
+    <w:r>
+      <w:rPr>
+        <w:rFonts w:ascii="Times New Roman" w:hAnsi="Times New Roman"/>
+        <w:color w:val="000000"/>
+        <w:sz w:val="26"/>
+      </w:rPr>
+      <w:t>15</w:t>
+    </w:r>
+  </w:p>
+</w:ftr>
+</file>
+
+<file path=word/footer19.xml><?xml version="1.0" encoding="utf-8"?>
+<w:ftr xmlns:m="http://schemas.openxmlformats.org/officeDocument/2006/math" xmlns:mc="http://schemas.openxmlformats.org/markup-compatibility/2006" xmlns:mo="http://schemas.microsoft.com/office/mac/office/2008/main" xmlns:mv="urn:schemas-microsoft-com:mac:vml" xmlns:o="urn:schemas-microsoft-com:office:office" xmlns:r="http://schemas.openxmlformats.org/officeDocument/2006/relationships" xmlns:v="urn:schemas-microsoft-com:vml" xmlns:w10="urn:schemas-microsoft-com:office:word" xmlns:w14="http://schemas.microsoft.com/office/word/2010/wordml" xmlns:w="http://schemas.openxmlformats.org/wordprocessingml/2006/main" xmlns:wne="http://schemas.microsoft.com/office/word/2006/wordml" xmlns:wp14="http://schemas.microsoft.com/office/word/2010/wordprocessingDrawing" xmlns:wp="http://schemas.openxmlformats.org/drawingml/2006/wordprocessingDrawing" xmlns:wpc="http://schemas.microsoft.com/office/word/2010/wordprocessingCanvas" xmlns:wpg="http://schemas.microsoft.com/office/word/2010/wordprocessingGroup" xmlns:wpi="http://schemas.microsoft.com/office/word/2010/wordprocessingInk" xmlns:wps="http://schemas.microsoft.com/office/word/2010/wordprocessingShape" mc:Ignorable="w14 wp14">
+  <w:p>
+    <w:pPr>
+      <w:spacing w:before="0" w:after="0" w:line="240" w:lineRule="auto"/>
+      <w:jc w:val="center"/>
+    </w:pPr>
+    <w:r>
+      <w:rPr>
+        <w:rFonts w:ascii="Times New Roman" w:hAnsi="Times New Roman"/>
+        <w:color w:val="000000"/>
+        <w:sz w:val="26"/>
+      </w:rPr>
+      <w:t>1</w:t>
     </w:r>
   </w:p>
 </w:ftr>
@@ -7925,9 +8402,389 @@
 </w:ftr>
 </file>
 
+<file path=word/footer20.xml><?xml version="1.0" encoding="utf-8"?>
+<w:ftr xmlns:m="http://schemas.openxmlformats.org/officeDocument/2006/math" xmlns:mc="http://schemas.openxmlformats.org/markup-compatibility/2006" xmlns:mo="http://schemas.microsoft.com/office/mac/office/2008/main" xmlns:mv="urn:schemas-microsoft-com:mac:vml" xmlns:o="urn:schemas-microsoft-com:office:office" xmlns:r="http://schemas.openxmlformats.org/officeDocument/2006/relationships" xmlns:v="urn:schemas-microsoft-com:vml" xmlns:w10="urn:schemas-microsoft-com:office:word" xmlns:w14="http://schemas.microsoft.com/office/word/2010/wordml" xmlns:w="http://schemas.openxmlformats.org/wordprocessingml/2006/main" xmlns:wne="http://schemas.microsoft.com/office/word/2006/wordml" xmlns:wp14="http://schemas.microsoft.com/office/word/2010/wordprocessingDrawing" xmlns:wp="http://schemas.openxmlformats.org/drawingml/2006/wordprocessingDrawing" xmlns:wpc="http://schemas.microsoft.com/office/word/2010/wordprocessingCanvas" xmlns:wpg="http://schemas.microsoft.com/office/word/2010/wordprocessingGroup" xmlns:wpi="http://schemas.microsoft.com/office/word/2010/wordprocessingInk" xmlns:wps="http://schemas.microsoft.com/office/word/2010/wordprocessingShape" mc:Ignorable="w14 wp14">
+  <w:p>
+    <w:pPr>
+      <w:spacing w:before="0" w:after="0" w:line="240" w:lineRule="auto"/>
+      <w:jc w:val="center"/>
+    </w:pPr>
+    <w:r>
+      <w:rPr>
+        <w:rFonts w:ascii="Times New Roman" w:hAnsi="Times New Roman"/>
+        <w:color w:val="000000"/>
+        <w:sz w:val="26"/>
+      </w:rPr>
+      <w:t>2</w:t>
+    </w:r>
+  </w:p>
+</w:ftr>
+</file>
+
+<file path=word/footer21.xml><?xml version="1.0" encoding="utf-8"?>
+<w:ftr xmlns:m="http://schemas.openxmlformats.org/officeDocument/2006/math" xmlns:mc="http://schemas.openxmlformats.org/markup-compatibility/2006" xmlns:mo="http://schemas.microsoft.com/office/mac/office/2008/main" xmlns:mv="urn:schemas-microsoft-com:mac:vml" xmlns:o="urn:schemas-microsoft-com:office:office" xmlns:r="http://schemas.openxmlformats.org/officeDocument/2006/relationships" xmlns:v="urn:schemas-microsoft-com:vml" xmlns:w10="urn:schemas-microsoft-com:office:word" xmlns:w14="http://schemas.microsoft.com/office/word/2010/wordml" xmlns:w="http://schemas.openxmlformats.org/wordprocessingml/2006/main" xmlns:wne="http://schemas.microsoft.com/office/word/2006/wordml" xmlns:wp14="http://schemas.microsoft.com/office/word/2010/wordprocessingDrawing" xmlns:wp="http://schemas.openxmlformats.org/drawingml/2006/wordprocessingDrawing" xmlns:wpc="http://schemas.microsoft.com/office/word/2010/wordprocessingCanvas" xmlns:wpg="http://schemas.microsoft.com/office/word/2010/wordprocessingGroup" xmlns:wpi="http://schemas.microsoft.com/office/word/2010/wordprocessingInk" xmlns:wps="http://schemas.microsoft.com/office/word/2010/wordprocessingShape" mc:Ignorable="w14 wp14">
+  <w:p>
+    <w:pPr>
+      <w:spacing w:before="0" w:after="0" w:line="240" w:lineRule="auto"/>
+      <w:jc w:val="center"/>
+    </w:pPr>
+    <w:r>
+      <w:rPr>
+        <w:rFonts w:ascii="Times New Roman" w:hAnsi="Times New Roman"/>
+        <w:color w:val="000000"/>
+        <w:sz w:val="26"/>
+      </w:rPr>
+      <w:t>3</w:t>
+    </w:r>
+  </w:p>
+</w:ftr>
+</file>
+
+<file path=word/footer22.xml><?xml version="1.0" encoding="utf-8"?>
+<w:ftr xmlns:m="http://schemas.openxmlformats.org/officeDocument/2006/math" xmlns:mc="http://schemas.openxmlformats.org/markup-compatibility/2006" xmlns:mo="http://schemas.microsoft.com/office/mac/office/2008/main" xmlns:mv="urn:schemas-microsoft-com:mac:vml" xmlns:o="urn:schemas-microsoft-com:office:office" xmlns:r="http://schemas.openxmlformats.org/officeDocument/2006/relationships" xmlns:v="urn:schemas-microsoft-com:vml" xmlns:w10="urn:schemas-microsoft-com:office:word" xmlns:w14="http://schemas.microsoft.com/office/word/2010/wordml" xmlns:w="http://schemas.openxmlformats.org/wordprocessingml/2006/main" xmlns:wne="http://schemas.microsoft.com/office/word/2006/wordml" xmlns:wp14="http://schemas.microsoft.com/office/word/2010/wordprocessingDrawing" xmlns:wp="http://schemas.openxmlformats.org/drawingml/2006/wordprocessingDrawing" xmlns:wpc="http://schemas.microsoft.com/office/word/2010/wordprocessingCanvas" xmlns:wpg="http://schemas.microsoft.com/office/word/2010/wordprocessingGroup" xmlns:wpi="http://schemas.microsoft.com/office/word/2010/wordprocessingInk" xmlns:wps="http://schemas.microsoft.com/office/word/2010/wordprocessingShape" mc:Ignorable="w14 wp14">
+  <w:p>
+    <w:pPr>
+      <w:spacing w:before="0" w:after="0" w:line="240" w:lineRule="auto"/>
+      <w:jc w:val="center"/>
+    </w:pPr>
+    <w:r>
+      <w:rPr>
+        <w:rFonts w:ascii="Times New Roman" w:hAnsi="Times New Roman"/>
+        <w:color w:val="000000"/>
+        <w:sz w:val="26"/>
+      </w:rPr>
+      <w:t>4</w:t>
+    </w:r>
+  </w:p>
+</w:ftr>
+</file>
+
+<file path=word/footer23.xml><?xml version="1.0" encoding="utf-8"?>
+<w:ftr xmlns:m="http://schemas.openxmlformats.org/officeDocument/2006/math" xmlns:mc="http://schemas.openxmlformats.org/markup-compatibility/2006" xmlns:mo="http://schemas.microsoft.com/office/mac/office/2008/main" xmlns:mv="urn:schemas-microsoft-com:mac:vml" xmlns:o="urn:schemas-microsoft-com:office:office" xmlns:r="http://schemas.openxmlformats.org/officeDocument/2006/relationships" xmlns:v="urn:schemas-microsoft-com:vml" xmlns:w10="urn:schemas-microsoft-com:office:word" xmlns:w14="http://schemas.microsoft.com/office/word/2010/wordml" xmlns:w="http://schemas.openxmlformats.org/wordprocessingml/2006/main" xmlns:wne="http://schemas.microsoft.com/office/word/2006/wordml" xmlns:wp14="http://schemas.microsoft.com/office/word/2010/wordprocessingDrawing" xmlns:wp="http://schemas.openxmlformats.org/drawingml/2006/wordprocessingDrawing" xmlns:wpc="http://schemas.microsoft.com/office/word/2010/wordprocessingCanvas" xmlns:wpg="http://schemas.microsoft.com/office/word/2010/wordprocessingGroup" xmlns:wpi="http://schemas.microsoft.com/office/word/2010/wordprocessingInk" xmlns:wps="http://schemas.microsoft.com/office/word/2010/wordprocessingShape" mc:Ignorable="w14 wp14">
+  <w:p>
+    <w:pPr>
+      <w:spacing w:before="0" w:after="0" w:line="240" w:lineRule="auto"/>
+      <w:jc w:val="center"/>
+    </w:pPr>
+    <w:r>
+      <w:rPr>
+        <w:rFonts w:ascii="Times New Roman" w:hAnsi="Times New Roman"/>
+        <w:color w:val="000000"/>
+        <w:sz w:val="26"/>
+      </w:rPr>
+      <w:t>5</w:t>
+    </w:r>
+  </w:p>
+</w:ftr>
+</file>
+
+<file path=word/footer24.xml><?xml version="1.0" encoding="utf-8"?>
+<w:ftr xmlns:m="http://schemas.openxmlformats.org/officeDocument/2006/math" xmlns:mc="http://schemas.openxmlformats.org/markup-compatibility/2006" xmlns:mo="http://schemas.microsoft.com/office/mac/office/2008/main" xmlns:mv="urn:schemas-microsoft-com:mac:vml" xmlns:o="urn:schemas-microsoft-com:office:office" xmlns:r="http://schemas.openxmlformats.org/officeDocument/2006/relationships" xmlns:v="urn:schemas-microsoft-com:vml" xmlns:w10="urn:schemas-microsoft-com:office:word" xmlns:w14="http://schemas.microsoft.com/office/word/2010/wordml" xmlns:w="http://schemas.openxmlformats.org/wordprocessingml/2006/main" xmlns:wne="http://schemas.microsoft.com/office/word/2006/wordml" xmlns:wp14="http://schemas.microsoft.com/office/word/2010/wordprocessingDrawing" xmlns:wp="http://schemas.openxmlformats.org/drawingml/2006/wordprocessingDrawing" xmlns:wpc="http://schemas.microsoft.com/office/word/2010/wordprocessingCanvas" xmlns:wpg="http://schemas.microsoft.com/office/word/2010/wordprocessingGroup" xmlns:wpi="http://schemas.microsoft.com/office/word/2010/wordprocessingInk" xmlns:wps="http://schemas.microsoft.com/office/word/2010/wordprocessingShape" mc:Ignorable="w14 wp14">
+  <w:p>
+    <w:pPr>
+      <w:spacing w:before="0" w:after="0" w:line="240" w:lineRule="auto"/>
+      <w:jc w:val="center"/>
+    </w:pPr>
+    <w:r>
+      <w:rPr>
+        <w:rFonts w:ascii="Times New Roman" w:hAnsi="Times New Roman"/>
+        <w:color w:val="000000"/>
+        <w:sz w:val="26"/>
+      </w:rPr>
+      <w:t>6</w:t>
+    </w:r>
+  </w:p>
+</w:ftr>
+</file>
+
+<file path=word/footer25.xml><?xml version="1.0" encoding="utf-8"?>
+<w:ftr xmlns:m="http://schemas.openxmlformats.org/officeDocument/2006/math" xmlns:mc="http://schemas.openxmlformats.org/markup-compatibility/2006" xmlns:mo="http://schemas.microsoft.com/office/mac/office/2008/main" xmlns:mv="urn:schemas-microsoft-com:mac:vml" xmlns:o="urn:schemas-microsoft-com:office:office" xmlns:r="http://schemas.openxmlformats.org/officeDocument/2006/relationships" xmlns:v="urn:schemas-microsoft-com:vml" xmlns:w10="urn:schemas-microsoft-com:office:word" xmlns:w14="http://schemas.microsoft.com/office/word/2010/wordml" xmlns:w="http://schemas.openxmlformats.org/wordprocessingml/2006/main" xmlns:wne="http://schemas.microsoft.com/office/word/2006/wordml" xmlns:wp14="http://schemas.microsoft.com/office/word/2010/wordprocessingDrawing" xmlns:wp="http://schemas.openxmlformats.org/drawingml/2006/wordprocessingDrawing" xmlns:wpc="http://schemas.microsoft.com/office/word/2010/wordprocessingCanvas" xmlns:wpg="http://schemas.microsoft.com/office/word/2010/wordprocessingGroup" xmlns:wpi="http://schemas.microsoft.com/office/word/2010/wordprocessingInk" xmlns:wps="http://schemas.microsoft.com/office/word/2010/wordprocessingShape" mc:Ignorable="w14 wp14">
+  <w:p>
+    <w:pPr>
+      <w:spacing w:before="0" w:after="0" w:line="240" w:lineRule="auto"/>
+      <w:jc w:val="center"/>
+    </w:pPr>
+    <w:r>
+      <w:rPr>
+        <w:rFonts w:ascii="Times New Roman" w:hAnsi="Times New Roman"/>
+        <w:color w:val="000000"/>
+        <w:sz w:val="26"/>
+      </w:rPr>
+      <w:t>7</w:t>
+    </w:r>
+  </w:p>
+</w:ftr>
+</file>
+
+<file path=word/footer26.xml><?xml version="1.0" encoding="utf-8"?>
+<w:ftr xmlns:m="http://schemas.openxmlformats.org/officeDocument/2006/math" xmlns:mc="http://schemas.openxmlformats.org/markup-compatibility/2006" xmlns:mo="http://schemas.microsoft.com/office/mac/office/2008/main" xmlns:mv="urn:schemas-microsoft-com:mac:vml" xmlns:o="urn:schemas-microsoft-com:office:office" xmlns:r="http://schemas.openxmlformats.org/officeDocument/2006/relationships" xmlns:v="urn:schemas-microsoft-com:vml" xmlns:w10="urn:schemas-microsoft-com:office:word" xmlns:w14="http://schemas.microsoft.com/office/word/2010/wordml" xmlns:w="http://schemas.openxmlformats.org/wordprocessingml/2006/main" xmlns:wne="http://schemas.microsoft.com/office/word/2006/wordml" xmlns:wp14="http://schemas.microsoft.com/office/word/2010/wordprocessingDrawing" xmlns:wp="http://schemas.openxmlformats.org/drawingml/2006/wordprocessingDrawing" xmlns:wpc="http://schemas.microsoft.com/office/word/2010/wordprocessingCanvas" xmlns:wpg="http://schemas.microsoft.com/office/word/2010/wordprocessingGroup" xmlns:wpi="http://schemas.microsoft.com/office/word/2010/wordprocessingInk" xmlns:wps="http://schemas.microsoft.com/office/word/2010/wordprocessingShape" mc:Ignorable="w14 wp14">
+  <w:p>
+    <w:pPr>
+      <w:spacing w:before="0" w:after="0" w:line="240" w:lineRule="auto"/>
+      <w:jc w:val="center"/>
+    </w:pPr>
+    <w:r>
+      <w:rPr>
+        <w:rFonts w:ascii="Times New Roman" w:hAnsi="Times New Roman"/>
+        <w:color w:val="000000"/>
+        <w:sz w:val="26"/>
+      </w:rPr>
+      <w:t>8</w:t>
+    </w:r>
+  </w:p>
+</w:ftr>
+</file>
+
+<file path=word/footer27.xml><?xml version="1.0" encoding="utf-8"?>
+<w:ftr xmlns:m="http://schemas.openxmlformats.org/officeDocument/2006/math" xmlns:mc="http://schemas.openxmlformats.org/markup-compatibility/2006" xmlns:mo="http://schemas.microsoft.com/office/mac/office/2008/main" xmlns:mv="urn:schemas-microsoft-com:mac:vml" xmlns:o="urn:schemas-microsoft-com:office:office" xmlns:r="http://schemas.openxmlformats.org/officeDocument/2006/relationships" xmlns:v="urn:schemas-microsoft-com:vml" xmlns:w10="urn:schemas-microsoft-com:office:word" xmlns:w14="http://schemas.microsoft.com/office/word/2010/wordml" xmlns:w="http://schemas.openxmlformats.org/wordprocessingml/2006/main" xmlns:wne="http://schemas.microsoft.com/office/word/2006/wordml" xmlns:wp14="http://schemas.microsoft.com/office/word/2010/wordprocessingDrawing" xmlns:wp="http://schemas.openxmlformats.org/drawingml/2006/wordprocessingDrawing" xmlns:wpc="http://schemas.microsoft.com/office/word/2010/wordprocessingCanvas" xmlns:wpg="http://schemas.microsoft.com/office/word/2010/wordprocessingGroup" xmlns:wpi="http://schemas.microsoft.com/office/word/2010/wordprocessingInk" xmlns:wps="http://schemas.microsoft.com/office/word/2010/wordprocessingShape" mc:Ignorable="w14 wp14">
+  <w:p>
+    <w:pPr>
+      <w:spacing w:before="0" w:after="0" w:line="240" w:lineRule="auto"/>
+      <w:jc w:val="center"/>
+    </w:pPr>
+    <w:r>
+      <w:rPr>
+        <w:rFonts w:ascii="Times New Roman" w:hAnsi="Times New Roman"/>
+        <w:color w:val="000000"/>
+        <w:sz w:val="26"/>
+      </w:rPr>
+      <w:t>9</w:t>
+    </w:r>
+  </w:p>
+</w:ftr>
+</file>
+
+<file path=word/footer28.xml><?xml version="1.0" encoding="utf-8"?>
+<w:ftr xmlns:m="http://schemas.openxmlformats.org/officeDocument/2006/math" xmlns:mc="http://schemas.openxmlformats.org/markup-compatibility/2006" xmlns:mo="http://schemas.microsoft.com/office/mac/office/2008/main" xmlns:mv="urn:schemas-microsoft-com:mac:vml" xmlns:o="urn:schemas-microsoft-com:office:office" xmlns:r="http://schemas.openxmlformats.org/officeDocument/2006/relationships" xmlns:v="urn:schemas-microsoft-com:vml" xmlns:w10="urn:schemas-microsoft-com:office:word" xmlns:w14="http://schemas.microsoft.com/office/word/2010/wordml" xmlns:w="http://schemas.openxmlformats.org/wordprocessingml/2006/main" xmlns:wne="http://schemas.microsoft.com/office/word/2006/wordml" xmlns:wp14="http://schemas.microsoft.com/office/word/2010/wordprocessingDrawing" xmlns:wp="http://schemas.openxmlformats.org/drawingml/2006/wordprocessingDrawing" xmlns:wpc="http://schemas.microsoft.com/office/word/2010/wordprocessingCanvas" xmlns:wpg="http://schemas.microsoft.com/office/word/2010/wordprocessingGroup" xmlns:wpi="http://schemas.microsoft.com/office/word/2010/wordprocessingInk" xmlns:wps="http://schemas.microsoft.com/office/word/2010/wordprocessingShape" mc:Ignorable="w14 wp14">
+  <w:p>
+    <w:pPr>
+      <w:spacing w:before="0" w:after="0" w:line="240" w:lineRule="auto"/>
+      <w:jc w:val="center"/>
+    </w:pPr>
+    <w:r>
+      <w:rPr>
+        <w:rFonts w:ascii="Times New Roman" w:hAnsi="Times New Roman"/>
+        <w:color w:val="000000"/>
+        <w:sz w:val="26"/>
+      </w:rPr>
+      <w:t>10</w:t>
+    </w:r>
+  </w:p>
+</w:ftr>
+</file>
+
+<file path=word/footer29.xml><?xml version="1.0" encoding="utf-8"?>
+<w:ftr xmlns:m="http://schemas.openxmlformats.org/officeDocument/2006/math" xmlns:mc="http://schemas.openxmlformats.org/markup-compatibility/2006" xmlns:mo="http://schemas.microsoft.com/office/mac/office/2008/main" xmlns:mv="urn:schemas-microsoft-com:mac:vml" xmlns:o="urn:schemas-microsoft-com:office:office" xmlns:r="http://schemas.openxmlformats.org/officeDocument/2006/relationships" xmlns:v="urn:schemas-microsoft-com:vml" xmlns:w10="urn:schemas-microsoft-com:office:word" xmlns:w14="http://schemas.microsoft.com/office/word/2010/wordml" xmlns:w="http://schemas.openxmlformats.org/wordprocessingml/2006/main" xmlns:wne="http://schemas.microsoft.com/office/word/2006/wordml" xmlns:wp14="http://schemas.microsoft.com/office/word/2010/wordprocessingDrawing" xmlns:wp="http://schemas.openxmlformats.org/drawingml/2006/wordprocessingDrawing" xmlns:wpc="http://schemas.microsoft.com/office/word/2010/wordprocessingCanvas" xmlns:wpg="http://schemas.microsoft.com/office/word/2010/wordprocessingGroup" xmlns:wpi="http://schemas.microsoft.com/office/word/2010/wordprocessingInk" xmlns:wps="http://schemas.microsoft.com/office/word/2010/wordprocessingShape" mc:Ignorable="w14 wp14">
+  <w:p>
+    <w:pPr>
+      <w:spacing w:before="0" w:after="0" w:line="240" w:lineRule="auto"/>
+      <w:jc w:val="center"/>
+    </w:pPr>
+    <w:r>
+      <w:rPr>
+        <w:rFonts w:ascii="Times New Roman" w:hAnsi="Times New Roman"/>
+        <w:color w:val="000000"/>
+        <w:sz w:val="26"/>
+      </w:rPr>
+      <w:t>11</w:t>
+    </w:r>
+  </w:p>
+</w:ftr>
+</file>
+
 <file path=word/footer3.xml><?xml version="1.0" encoding="utf-8"?>
 <w:ftr xmlns:wpc="http://schemas.microsoft.com/office/word/2010/wordprocessingCanvas" xmlns:mc="http://schemas.openxmlformats.org/markup-compatibility/2006" xmlns:o="urn:schemas-microsoft-com:office:office" xmlns:r="http://schemas.openxmlformats.org/officeDocument/2006/relationships" xmlns:m="http://schemas.openxmlformats.org/officeDocument/2006/math" xmlns:v="urn:schemas-microsoft-com:vml" xmlns:wp14="http://schemas.microsoft.com/office/word/2010/wordprocessingDrawing" xmlns:wp="http://schemas.openxmlformats.org/drawingml/2006/wordprocessingDrawing" xmlns:w10="urn:schemas-microsoft-com:office:word" xmlns:w="http://schemas.openxmlformats.org/wordprocessingml/2006/main" xmlns:w14="http://schemas.microsoft.com/office/word/2010/wordml" xmlns:w15="http://schemas.microsoft.com/office/word/2012/wordml" xmlns:wpg="http://schemas.microsoft.com/office/word/2010/wordprocessingGroup" xmlns:wpi="http://schemas.microsoft.com/office/word/2010/wordprocessingInk" xmlns:wne="http://schemas.microsoft.com/office/word/2006/wordml" xmlns:wps="http://schemas.microsoft.com/office/word/2010/wordprocessingShape" xmlns:wpsCustomData="http://www.wps.cn/officeDocument/2013/wpsCustomData" mc:Ignorable="w14 w15 wp14">
   <w:p/>
+</w:ftr>
+</file>
+
+<file path=word/footer30.xml><?xml version="1.0" encoding="utf-8"?>
+<w:ftr xmlns:m="http://schemas.openxmlformats.org/officeDocument/2006/math" xmlns:mc="http://schemas.openxmlformats.org/markup-compatibility/2006" xmlns:mo="http://schemas.microsoft.com/office/mac/office/2008/main" xmlns:mv="urn:schemas-microsoft-com:mac:vml" xmlns:o="urn:schemas-microsoft-com:office:office" xmlns:r="http://schemas.openxmlformats.org/officeDocument/2006/relationships" xmlns:v="urn:schemas-microsoft-com:vml" xmlns:w10="urn:schemas-microsoft-com:office:word" xmlns:w14="http://schemas.microsoft.com/office/word/2010/wordml" xmlns:w="http://schemas.openxmlformats.org/wordprocessingml/2006/main" xmlns:wne="http://schemas.microsoft.com/office/word/2006/wordml" xmlns:wp14="http://schemas.microsoft.com/office/word/2010/wordprocessingDrawing" xmlns:wp="http://schemas.openxmlformats.org/drawingml/2006/wordprocessingDrawing" xmlns:wpc="http://schemas.microsoft.com/office/word/2010/wordprocessingCanvas" xmlns:wpg="http://schemas.microsoft.com/office/word/2010/wordprocessingGroup" xmlns:wpi="http://schemas.microsoft.com/office/word/2010/wordprocessingInk" xmlns:wps="http://schemas.microsoft.com/office/word/2010/wordprocessingShape" mc:Ignorable="w14 wp14">
+  <w:p>
+    <w:pPr>
+      <w:spacing w:before="0" w:after="0" w:line="240" w:lineRule="auto"/>
+      <w:jc w:val="center"/>
+    </w:pPr>
+    <w:r>
+      <w:rPr>
+        <w:rFonts w:ascii="Times New Roman" w:hAnsi="Times New Roman"/>
+        <w:color w:val="000000"/>
+        <w:sz w:val="26"/>
+      </w:rPr>
+      <w:t>12</w:t>
+    </w:r>
+  </w:p>
+</w:ftr>
+</file>
+
+<file path=word/footer31.xml><?xml version="1.0" encoding="utf-8"?>
+<w:ftr xmlns:m="http://schemas.openxmlformats.org/officeDocument/2006/math" xmlns:mc="http://schemas.openxmlformats.org/markup-compatibility/2006" xmlns:mo="http://schemas.microsoft.com/office/mac/office/2008/main" xmlns:mv="urn:schemas-microsoft-com:mac:vml" xmlns:o="urn:schemas-microsoft-com:office:office" xmlns:r="http://schemas.openxmlformats.org/officeDocument/2006/relationships" xmlns:v="urn:schemas-microsoft-com:vml" xmlns:w10="urn:schemas-microsoft-com:office:word" xmlns:w14="http://schemas.microsoft.com/office/word/2010/wordml" xmlns:w="http://schemas.openxmlformats.org/wordprocessingml/2006/main" xmlns:wne="http://schemas.microsoft.com/office/word/2006/wordml" xmlns:wp14="http://schemas.microsoft.com/office/word/2010/wordprocessingDrawing" xmlns:wp="http://schemas.openxmlformats.org/drawingml/2006/wordprocessingDrawing" xmlns:wpc="http://schemas.microsoft.com/office/word/2010/wordprocessingCanvas" xmlns:wpg="http://schemas.microsoft.com/office/word/2010/wordprocessingGroup" xmlns:wpi="http://schemas.microsoft.com/office/word/2010/wordprocessingInk" xmlns:wps="http://schemas.microsoft.com/office/word/2010/wordprocessingShape" mc:Ignorable="w14 wp14">
+  <w:p>
+    <w:pPr>
+      <w:spacing w:before="0" w:after="0" w:line="240" w:lineRule="auto"/>
+      <w:jc w:val="center"/>
+    </w:pPr>
+    <w:r>
+      <w:rPr>
+        <w:rFonts w:ascii="Times New Roman" w:hAnsi="Times New Roman"/>
+        <w:color w:val="000000"/>
+        <w:sz w:val="26"/>
+      </w:rPr>
+      <w:t>13</w:t>
+    </w:r>
+  </w:p>
+</w:ftr>
+</file>
+
+<file path=word/footer32.xml><?xml version="1.0" encoding="utf-8"?>
+<w:ftr xmlns:m="http://schemas.openxmlformats.org/officeDocument/2006/math" xmlns:mc="http://schemas.openxmlformats.org/markup-compatibility/2006" xmlns:mo="http://schemas.microsoft.com/office/mac/office/2008/main" xmlns:mv="urn:schemas-microsoft-com:mac:vml" xmlns:o="urn:schemas-microsoft-com:office:office" xmlns:r="http://schemas.openxmlformats.org/officeDocument/2006/relationships" xmlns:v="urn:schemas-microsoft-com:vml" xmlns:w10="urn:schemas-microsoft-com:office:word" xmlns:w14="http://schemas.microsoft.com/office/word/2010/wordml" xmlns:w="http://schemas.openxmlformats.org/wordprocessingml/2006/main" xmlns:wne="http://schemas.microsoft.com/office/word/2006/wordml" xmlns:wp14="http://schemas.microsoft.com/office/word/2010/wordprocessingDrawing" xmlns:wp="http://schemas.openxmlformats.org/drawingml/2006/wordprocessingDrawing" xmlns:wpc="http://schemas.microsoft.com/office/word/2010/wordprocessingCanvas" xmlns:wpg="http://schemas.microsoft.com/office/word/2010/wordprocessingGroup" xmlns:wpi="http://schemas.microsoft.com/office/word/2010/wordprocessingInk" xmlns:wps="http://schemas.microsoft.com/office/word/2010/wordprocessingShape" mc:Ignorable="w14 wp14">
+  <w:p>
+    <w:pPr>
+      <w:spacing w:before="0" w:after="0" w:line="240" w:lineRule="auto"/>
+      <w:jc w:val="center"/>
+    </w:pPr>
+    <w:r>
+      <w:rPr>
+        <w:rFonts w:ascii="Times New Roman" w:hAnsi="Times New Roman"/>
+        <w:color w:val="000000"/>
+        <w:sz w:val="26"/>
+      </w:rPr>
+      <w:t>14</w:t>
+    </w:r>
+  </w:p>
+</w:ftr>
+</file>
+
+<file path=word/footer33.xml><?xml version="1.0" encoding="utf-8"?>
+<w:ftr xmlns:m="http://schemas.openxmlformats.org/officeDocument/2006/math" xmlns:mc="http://schemas.openxmlformats.org/markup-compatibility/2006" xmlns:mo="http://schemas.microsoft.com/office/mac/office/2008/main" xmlns:mv="urn:schemas-microsoft-com:mac:vml" xmlns:o="urn:schemas-microsoft-com:office:office" xmlns:r="http://schemas.openxmlformats.org/officeDocument/2006/relationships" xmlns:v="urn:schemas-microsoft-com:vml" xmlns:w10="urn:schemas-microsoft-com:office:word" xmlns:w14="http://schemas.microsoft.com/office/word/2010/wordml" xmlns:w="http://schemas.openxmlformats.org/wordprocessingml/2006/main" xmlns:wne="http://schemas.microsoft.com/office/word/2006/wordml" xmlns:wp14="http://schemas.microsoft.com/office/word/2010/wordprocessingDrawing" xmlns:wp="http://schemas.openxmlformats.org/drawingml/2006/wordprocessingDrawing" xmlns:wpc="http://schemas.microsoft.com/office/word/2010/wordprocessingCanvas" xmlns:wpg="http://schemas.microsoft.com/office/word/2010/wordprocessingGroup" xmlns:wpi="http://schemas.microsoft.com/office/word/2010/wordprocessingInk" xmlns:wps="http://schemas.microsoft.com/office/word/2010/wordprocessingShape" mc:Ignorable="w14 wp14">
+  <w:p>
+    <w:pPr>
+      <w:spacing w:before="0" w:after="0" w:line="240" w:lineRule="auto"/>
+      <w:jc w:val="center"/>
+    </w:pPr>
+    <w:r>
+      <w:rPr>
+        <w:rFonts w:ascii="Times New Roman" w:hAnsi="Times New Roman"/>
+        <w:color w:val="000000"/>
+        <w:sz w:val="26"/>
+      </w:rPr>
+      <w:t>15</w:t>
+    </w:r>
+  </w:p>
+</w:ftr>
+</file>
+
+<file path=word/footer4.xml><?xml version="1.0" encoding="utf-8"?>
+<w:ftr xmlns:m="http://schemas.openxmlformats.org/officeDocument/2006/math" xmlns:mc="http://schemas.openxmlformats.org/markup-compatibility/2006" xmlns:mo="http://schemas.microsoft.com/office/mac/office/2008/main" xmlns:mv="urn:schemas-microsoft-com:mac:vml" xmlns:o="urn:schemas-microsoft-com:office:office" xmlns:r="http://schemas.openxmlformats.org/officeDocument/2006/relationships" xmlns:v="urn:schemas-microsoft-com:vml" xmlns:w10="urn:schemas-microsoft-com:office:word" xmlns:w14="http://schemas.microsoft.com/office/word/2010/wordml" xmlns:w="http://schemas.openxmlformats.org/wordprocessingml/2006/main" xmlns:wne="http://schemas.microsoft.com/office/word/2006/wordml" xmlns:wp14="http://schemas.microsoft.com/office/word/2010/wordprocessingDrawing" xmlns:wp="http://schemas.openxmlformats.org/drawingml/2006/wordprocessingDrawing" xmlns:wpc="http://schemas.microsoft.com/office/word/2010/wordprocessingCanvas" xmlns:wpg="http://schemas.microsoft.com/office/word/2010/wordprocessingGroup" xmlns:wpi="http://schemas.microsoft.com/office/word/2010/wordprocessingInk" xmlns:wps="http://schemas.microsoft.com/office/word/2010/wordprocessingShape" mc:Ignorable="w14 wp14">
+  <w:p>
+    <w:pPr>
+      <w:spacing w:before="0" w:after="0" w:line="240" w:lineRule="auto"/>
+      <w:jc w:val="center"/>
+    </w:pPr>
+    <w:r>
+      <w:rPr>
+        <w:rFonts w:ascii="Times New Roman" w:hAnsi="Times New Roman"/>
+        <w:color w:val="000000"/>
+        <w:sz w:val="26"/>
+      </w:rPr>
+      <w:t>1</w:t>
+    </w:r>
+  </w:p>
+</w:ftr>
+</file>
+
+<file path=word/footer5.xml><?xml version="1.0" encoding="utf-8"?>
+<w:ftr xmlns:m="http://schemas.openxmlformats.org/officeDocument/2006/math" xmlns:mc="http://schemas.openxmlformats.org/markup-compatibility/2006" xmlns:mo="http://schemas.microsoft.com/office/mac/office/2008/main" xmlns:mv="urn:schemas-microsoft-com:mac:vml" xmlns:o="urn:schemas-microsoft-com:office:office" xmlns:r="http://schemas.openxmlformats.org/officeDocument/2006/relationships" xmlns:v="urn:schemas-microsoft-com:vml" xmlns:w10="urn:schemas-microsoft-com:office:word" xmlns:w14="http://schemas.microsoft.com/office/word/2010/wordml" xmlns:w="http://schemas.openxmlformats.org/wordprocessingml/2006/main" xmlns:wne="http://schemas.microsoft.com/office/word/2006/wordml" xmlns:wp14="http://schemas.microsoft.com/office/word/2010/wordprocessingDrawing" xmlns:wp="http://schemas.openxmlformats.org/drawingml/2006/wordprocessingDrawing" xmlns:wpc="http://schemas.microsoft.com/office/word/2010/wordprocessingCanvas" xmlns:wpg="http://schemas.microsoft.com/office/word/2010/wordprocessingGroup" xmlns:wpi="http://schemas.microsoft.com/office/word/2010/wordprocessingInk" xmlns:wps="http://schemas.microsoft.com/office/word/2010/wordprocessingShape" mc:Ignorable="w14 wp14">
+  <w:p>
+    <w:pPr>
+      <w:spacing w:before="0" w:after="0" w:line="240" w:lineRule="auto"/>
+      <w:jc w:val="center"/>
+    </w:pPr>
+    <w:r>
+      <w:rPr>
+        <w:rFonts w:ascii="Times New Roman" w:hAnsi="Times New Roman"/>
+        <w:color w:val="000000"/>
+        <w:sz w:val="26"/>
+      </w:rPr>
+      <w:t>2</w:t>
+    </w:r>
+  </w:p>
+</w:ftr>
+</file>
+
+<file path=word/footer6.xml><?xml version="1.0" encoding="utf-8"?>
+<w:ftr xmlns:m="http://schemas.openxmlformats.org/officeDocument/2006/math" xmlns:mc="http://schemas.openxmlformats.org/markup-compatibility/2006" xmlns:mo="http://schemas.microsoft.com/office/mac/office/2008/main" xmlns:mv="urn:schemas-microsoft-com:mac:vml" xmlns:o="urn:schemas-microsoft-com:office:office" xmlns:r="http://schemas.openxmlformats.org/officeDocument/2006/relationships" xmlns:v="urn:schemas-microsoft-com:vml" xmlns:w10="urn:schemas-microsoft-com:office:word" xmlns:w14="http://schemas.microsoft.com/office/word/2010/wordml" xmlns:w="http://schemas.openxmlformats.org/wordprocessingml/2006/main" xmlns:wne="http://schemas.microsoft.com/office/word/2006/wordml" xmlns:wp14="http://schemas.microsoft.com/office/word/2010/wordprocessingDrawing" xmlns:wp="http://schemas.openxmlformats.org/drawingml/2006/wordprocessingDrawing" xmlns:wpc="http://schemas.microsoft.com/office/word/2010/wordprocessingCanvas" xmlns:wpg="http://schemas.microsoft.com/office/word/2010/wordprocessingGroup" xmlns:wpi="http://schemas.microsoft.com/office/word/2010/wordprocessingInk" xmlns:wps="http://schemas.microsoft.com/office/word/2010/wordprocessingShape" mc:Ignorable="w14 wp14">
+  <w:p>
+    <w:pPr>
+      <w:spacing w:before="0" w:after="0" w:line="240" w:lineRule="auto"/>
+      <w:jc w:val="center"/>
+    </w:pPr>
+    <w:r>
+      <w:rPr>
+        <w:rFonts w:ascii="Times New Roman" w:hAnsi="Times New Roman"/>
+        <w:color w:val="000000"/>
+        <w:sz w:val="26"/>
+      </w:rPr>
+      <w:t>3</w:t>
+    </w:r>
+  </w:p>
+</w:ftr>
+</file>
+
+<file path=word/footer7.xml><?xml version="1.0" encoding="utf-8"?>
+<w:ftr xmlns:m="http://schemas.openxmlformats.org/officeDocument/2006/math" xmlns:mc="http://schemas.openxmlformats.org/markup-compatibility/2006" xmlns:mo="http://schemas.microsoft.com/office/mac/office/2008/main" xmlns:mv="urn:schemas-microsoft-com:mac:vml" xmlns:o="urn:schemas-microsoft-com:office:office" xmlns:r="http://schemas.openxmlformats.org/officeDocument/2006/relationships" xmlns:v="urn:schemas-microsoft-com:vml" xmlns:w10="urn:schemas-microsoft-com:office:word" xmlns:w14="http://schemas.microsoft.com/office/word/2010/wordml" xmlns:w="http://schemas.openxmlformats.org/wordprocessingml/2006/main" xmlns:wne="http://schemas.microsoft.com/office/word/2006/wordml" xmlns:wp14="http://schemas.microsoft.com/office/word/2010/wordprocessingDrawing" xmlns:wp="http://schemas.openxmlformats.org/drawingml/2006/wordprocessingDrawing" xmlns:wpc="http://schemas.microsoft.com/office/word/2010/wordprocessingCanvas" xmlns:wpg="http://schemas.microsoft.com/office/word/2010/wordprocessingGroup" xmlns:wpi="http://schemas.microsoft.com/office/word/2010/wordprocessingInk" xmlns:wps="http://schemas.microsoft.com/office/word/2010/wordprocessingShape" mc:Ignorable="w14 wp14">
+  <w:p>
+    <w:pPr>
+      <w:spacing w:before="0" w:after="0" w:line="240" w:lineRule="auto"/>
+      <w:jc w:val="center"/>
+    </w:pPr>
+    <w:r>
+      <w:rPr>
+        <w:rFonts w:ascii="Times New Roman" w:hAnsi="Times New Roman"/>
+        <w:color w:val="000000"/>
+        <w:sz w:val="26"/>
+      </w:rPr>
+      <w:t>4</w:t>
+    </w:r>
+  </w:p>
+</w:ftr>
+</file>
+
+<file path=word/footer8.xml><?xml version="1.0" encoding="utf-8"?>
+<w:ftr xmlns:m="http://schemas.openxmlformats.org/officeDocument/2006/math" xmlns:mc="http://schemas.openxmlformats.org/markup-compatibility/2006" xmlns:mo="http://schemas.microsoft.com/office/mac/office/2008/main" xmlns:mv="urn:schemas-microsoft-com:mac:vml" xmlns:o="urn:schemas-microsoft-com:office:office" xmlns:r="http://schemas.openxmlformats.org/officeDocument/2006/relationships" xmlns:v="urn:schemas-microsoft-com:vml" xmlns:w10="urn:schemas-microsoft-com:office:word" xmlns:w14="http://schemas.microsoft.com/office/word/2010/wordml" xmlns:w="http://schemas.openxmlformats.org/wordprocessingml/2006/main" xmlns:wne="http://schemas.microsoft.com/office/word/2006/wordml" xmlns:wp14="http://schemas.microsoft.com/office/word/2010/wordprocessingDrawing" xmlns:wp="http://schemas.openxmlformats.org/drawingml/2006/wordprocessingDrawing" xmlns:wpc="http://schemas.microsoft.com/office/word/2010/wordprocessingCanvas" xmlns:wpg="http://schemas.microsoft.com/office/word/2010/wordprocessingGroup" xmlns:wpi="http://schemas.microsoft.com/office/word/2010/wordprocessingInk" xmlns:wps="http://schemas.microsoft.com/office/word/2010/wordprocessingShape" mc:Ignorable="w14 wp14">
+  <w:p>
+    <w:pPr>
+      <w:spacing w:before="0" w:after="0" w:line="240" w:lineRule="auto"/>
+      <w:jc w:val="center"/>
+    </w:pPr>
+    <w:r>
+      <w:rPr>
+        <w:rFonts w:ascii="Times New Roman" w:hAnsi="Times New Roman"/>
+        <w:color w:val="000000"/>
+        <w:sz w:val="26"/>
+      </w:rPr>
+      <w:t>5</w:t>
+    </w:r>
+  </w:p>
+</w:ftr>
+</file>
+
+<file path=word/footer9.xml><?xml version="1.0" encoding="utf-8"?>
+<w:ftr xmlns:m="http://schemas.openxmlformats.org/officeDocument/2006/math" xmlns:mc="http://schemas.openxmlformats.org/markup-compatibility/2006" xmlns:mo="http://schemas.microsoft.com/office/mac/office/2008/main" xmlns:mv="urn:schemas-microsoft-com:mac:vml" xmlns:o="urn:schemas-microsoft-com:office:office" xmlns:r="http://schemas.openxmlformats.org/officeDocument/2006/relationships" xmlns:v="urn:schemas-microsoft-com:vml" xmlns:w10="urn:schemas-microsoft-com:office:word" xmlns:w14="http://schemas.microsoft.com/office/word/2010/wordml" xmlns:w="http://schemas.openxmlformats.org/wordprocessingml/2006/main" xmlns:wne="http://schemas.microsoft.com/office/word/2006/wordml" xmlns:wp14="http://schemas.microsoft.com/office/word/2010/wordprocessingDrawing" xmlns:wp="http://schemas.openxmlformats.org/drawingml/2006/wordprocessingDrawing" xmlns:wpc="http://schemas.microsoft.com/office/word/2010/wordprocessingCanvas" xmlns:wpg="http://schemas.microsoft.com/office/word/2010/wordprocessingGroup" xmlns:wpi="http://schemas.microsoft.com/office/word/2010/wordprocessingInk" xmlns:wps="http://schemas.microsoft.com/office/word/2010/wordprocessingShape" mc:Ignorable="w14 wp14">
+  <w:p>
+    <w:pPr>
+      <w:spacing w:before="0" w:after="0" w:line="240" w:lineRule="auto"/>
+      <w:jc w:val="center"/>
+    </w:pPr>
+    <w:r>
+      <w:rPr>
+        <w:rFonts w:ascii="Times New Roman" w:hAnsi="Times New Roman"/>
+        <w:color w:val="000000"/>
+        <w:sz w:val="26"/>
+      </w:rPr>
+      <w:t>6</w:t>
+    </w:r>
+  </w:p>
 </w:ftr>
 </file>
 

</xml_diff>